<commit_message>
feat(diagnostico): diagnóstico por equipo (tabla ancha) + vista vw_UltimoAnalisisFlota
- DDL_vistas.sql: vista #9 vw_UltimoAnalisisFlota = vw_UltimoAnalisisAceite
  (todos los componentes, última no-DDI, params+LP/LC+Estado) + Hor. Comp. real
  de HsCc. Aislada para 1 equipo; filtra Compartimiento NULL/vacío. NO toca el barrido.
- VALIDACION_SSMS.sql: Bloque 13 (fuente diagnóstico, no-regresión vs barrido, Hor. Comp.).
- KomfIA_SQL: enrutamiento + plantilla de diagnóstico (vw_UltimoAnalisisFlota).
- Formatos_de_Respuesta: sección Diagnóstico reescrita a TABLA ANCHA
  (componentes en columnas, params relevantes por componente + chip, sin LP/LC).
- KomfIA_central: diagnóstico = flujo independiente del barrido.

Validado en SSMS y en Copilot (CA3177): tabla ancha + recomendaciones verbatim MT.

Co-Authored-By: Claude Opus 4.8 <noreply@anthropic.com>
</commit_message>
<xml_diff>
--- a/docs/copilot/KomfIA_SQL.docx
+++ b/docs/copilot/KomfIA_SQL.docx
@@ -139,6 +139,17 @@
       </w:r>
     </w:p>
     <w:p>
+      <w:pPr/>
+      <w:r>
+        <w:rPr>
+          <w:rFonts w:ascii="Courier New" w:hAnsi="Courier New"/>
+          <w:color w:val="1A1A1A"/>
+          <w:sz w:val="17"/>
+        </w:rPr>
+        <w:t>- vw_UltimoAnalisisFlota → DIAGNÓSTICO de UN equipo: TODOS los componentes (incluye OK) con todos los params + LP/LC + Estado + Hor. Comp. real. SELECT COLUMNAS ESTÁNDAR + HorasComponente. ⛔ NO para barrido (no filtra observados).</w:t>
+      </w:r>
+    </w:p>
+    <w:p>
       <w:pPr>
         <w:spacing w:before="0" w:after="0"/>
         <w:ind w:left="170"/>
@@ -214,7 +225,7 @@
           <w:color w:val="1A1A1A"/>
           <w:sz w:val="17"/>
         </w:rPr>
-        <w:t>ENRUTAMIENTO (decide la vista ANTES de escribir el SELECT): «qué EQUIPOS observados / barrido / observados de la flota/proyecto/modelo» (SIN decir MT/motor/tracción) → BARRIDO 2-pasos: PASO 1 SELECT * FROM vw_ObservadosResumen; PASO 2 SELECT * FROM vw_ObservadosDetalle. El follow-up «detalle / detalle completo / detalle de todos / detalle de un equipo» TRAS un barrido = PASO 2 (vw_ObservadosDetalle). ⛔ En barrido NUNCA vw_EstadoActualMT, vw_UltimoAnalisisAceite ni vw_MuestrasEstado. «MOTORES/MT/tracción observados/triage» → vw_EstadoActualMT. Condición/diagnóstico de 1 equipo nombrado → vw_EstadoActualMT (MT) o vw_MuestrasEstado (integral). «último análisis» de 1 equipo → vw_UltimoAnalisisAceite.</w:t>
+        <w:t>ENRUTAMIENTO (decide la vista ANTES de escribir el SELECT): «qué EQUIPOS observados / barrido / observados de la flota/proyecto/modelo» (SIN decir MT/motor/tracción) → BARRIDO 2-pasos: PASO 1 SELECT * FROM vw_ObservadosResumen; PASO 2 SELECT * FROM vw_ObservadosDetalle. El follow-up «detalle / detalle completo / detalle de todos / detalle de un equipo» TRAS un barrido = PASO 2 (vw_ObservadosDetalle). ⛔ En barrido NUNCA vw_EstadoActualMT, vw_UltimoAnalisisAceite ni vw_MuestrasEstado. «MOTORES/MT/tracción observados/triage» → vw_EstadoActualMT. Condición de 1 equipo MT → vw_EstadoActualMT. DIAGNÓSTICO / «estado completo» / «todos los componentes» de 1 equipo → vw_UltimoAnalisisFlota. «último análisis» de 1 equipo (1 compartimiento) → vw_UltimoAnalisisAceite. HISTORIAL muestra por muestra → vw_MuestrasEstado.</w:t>
       </w:r>
     </w:p>
     <w:p>
@@ -333,7 +344,7 @@
           <w:color w:val="1A1A1A"/>
           <w:sz w:val="17"/>
         </w:rPr>
-        <w:t>- Diagnóstico integral (sin DDI): vw_MuestrasEstado WHERE Equipo='CA3177' AND EsDDI=0 AND rn_recencia=1 ORDER BY Compartimiento.</w:t>
+        <w:t>- Diagnóstico por equipo (TODOS los componentes, incluye OK): SELECT &lt;COLUMNAS ESTÁNDAR&gt;, HorasComponente FROM vw_UltimoAnalisisFlota WHERE Equipo='CA3177' ORDER BY Compartimiento.</w:t>
       </w:r>
     </w:p>
     <w:p>

</xml_diff>

<commit_message>
feat(tendencia): vista vw_TendenciaElemento (detalle por elemento) + tendencia 2 pasos
- DDL_vistas.sql: vista #10 vw_TendenciaElemento (unpivot CROSS APPLY; d1..d8
  cronológicos con chip embebido, f1..f8, Prom/Sigma/Tendencia, EsRelevante).
  Mismo patrón del barrido: servidor pre-formatea, central pinta.
- KomfIA_central / KomfIA_SQL: tendencia en 2 pasos (PASO 1 general + oferta;
  PASO 2 detalle por elemento vía vw_TendenciaElemento). Diagnóstico preservado.
- Formatos: tendencia 2 pasos + alternativa timeline CM/Estado + fix encabezado PASO 1 barrido.
- Esquema_y_Patrones_SQL: limpieza (quita SQL obsoleto pre-vistas) → catálogo de 10 vistas.
- KomfIA_SQL compactado 7998→7551 ch (quita duplicación con Esquema; reglas/rutas intactas).
- VALIDACION_SSMS: Bloque 0 (10 vistas) + Bloque 14 (tendencia).

Vistas ya aplicadas y probadas en BD/Copilot.

Co-Authored-By: Claude Opus 4.8 <noreply@anthropic.com>
</commit_message>
<xml_diff>
--- a/docs/copilot/KomfIA_SQL.docx
+++ b/docs/copilot/KomfIA_SQL.docx
@@ -101,7 +101,7 @@
           <w:color w:val="1A1A1A"/>
           <w:sz w:val="17"/>
         </w:rPr>
-        <w:t>- vw_MuestrasEstado → TODA muestra (flag EsDDI), cualquier comp. HISTORIAL/DIAGNÓSTICO de UN equipo (rn_recencia=1 = última en uso). ⛔ NO la uses para barrido de flota.</w:t>
+        <w:t>- vw_MuestrasEstado → TODA muestra (flag EsDDI), cualquier comp. HISTORIAL muestra por muestra (rn_recencia=1 = última en uso). ⛔ NO para barrido.</w:t>
       </w:r>
     </w:p>
     <w:p>
@@ -118,7 +118,7 @@
           <w:color w:val="1A1A1A"/>
           <w:sz w:val="17"/>
         </w:rPr>
-        <w:t>- vw_ObservadosDetalle → DETALLE de barrido = 1 fila por equipo+comp. observado, LIGERA y PRE-FORMATEADA (Equipo, Compartimiento, FechaMuestreo, HorasComponente, CM, NumCrit, Detalle). PASO 2. SIEMPRE SELECT *. (vw_ObservadosFlota es solo la base interna; ⛔ NO la consultes directo.)</w:t>
+        <w:t>- vw_ObservadosDetalle → DETALLE de barrido (1 fila/equipo+comp observado), LIGERA y PRE-FORMATEADA con columna Detalle. PASO 2. SIEMPRE SELECT *. (vw_ObservadosFlota es base interna; ⛔ NO la consultes directo.)</w:t>
       </w:r>
     </w:p>
     <w:p>
@@ -146,7 +146,18 @@
           <w:color w:val="1A1A1A"/>
           <w:sz w:val="17"/>
         </w:rPr>
-        <w:t>- vw_UltimoAnalisisFlota → DIAGNÓSTICO de UN equipo: TODOS los componentes (incluye OK) con todos los params + LP/LC + Estado + Hor. Comp. real. SELECT COLUMNAS ESTÁNDAR + HorasComponente. ⛔ NO para barrido (no filtra observados).</w:t>
+        <w:t>- vw_UltimoAnalisisFlota → DIAGNÓSTICO de 1 equipo: TODOS los componentes (incluye OK) + LP/LC + Estado + Hor. Comp. SELECT COLUMNAS ESTÁNDAR + HorasComponente. ⛔ NO para barrido.</w:t>
+      </w:r>
+    </w:p>
+    <w:p>
+      <w:pPr/>
+      <w:r>
+        <w:rPr>
+          <w:rFonts w:ascii="Courier New" w:hAnsi="Courier New"/>
+          <w:color w:val="1A1A1A"/>
+          <w:sz w:val="17"/>
+        </w:rPr>
+        <w:t>- vw_TendenciaElemento → DETALLE POR ELEMENTO de tendencia (PASO 2), PRE-FORMATEADO: 1 fila/parámetro con d1..d8 (chips), f1..f8, Prom/Sigma/Tendencia/Inf, EsRelevante. SELECT * (ligera).</w:t>
       </w:r>
     </w:p>
     <w:p>
@@ -225,7 +236,7 @@
           <w:color w:val="1A1A1A"/>
           <w:sz w:val="17"/>
         </w:rPr>
-        <w:t>ENRUTAMIENTO (decide la vista ANTES de escribir el SELECT): «qué EQUIPOS observados / barrido / observados de la flota/proyecto/modelo» (SIN decir MT/motor/tracción) → BARRIDO 2-pasos: PASO 1 SELECT * FROM vw_ObservadosResumen; PASO 2 SELECT * FROM vw_ObservadosDetalle. El follow-up «detalle / detalle completo / detalle de todos / detalle de un equipo» TRAS un barrido = PASO 2 (vw_ObservadosDetalle). ⛔ En barrido NUNCA vw_EstadoActualMT, vw_UltimoAnalisisAceite ni vw_MuestrasEstado. «MOTORES/MT/tracción observados/triage» → vw_EstadoActualMT. Condición de 1 equipo MT → vw_EstadoActualMT. DIAGNÓSTICO / «estado completo» / «todos los componentes» de 1 equipo → vw_UltimoAnalisisFlota. «último análisis» de 1 equipo (1 compartimiento) → vw_UltimoAnalisisAceite. HISTORIAL muestra por muestra → vw_MuestrasEstado.</w:t>
+        <w:t>ENRUTAMIENTO (decide la vista ANTES de escribir el SELECT): «qué EQUIPOS observados / barrido / observados de la flota/proyecto/modelo» (SIN decir MT/motor/tracción) → BARRIDO 2-pasos: PASO 1 SELECT * FROM vw_ObservadosResumen; PASO 2 SELECT * FROM vw_ObservadosDetalle. El follow-up «detalle / detalle completo / detalle de todos / detalle de un equipo» TRAS un barrido = PASO 2 (vw_ObservadosDetalle). ⛔ En barrido NUNCA vw_EstadoActualMT, vw_UltimoAnalisisAceite ni vw_MuestrasEstado. «MOTORES/MT/tracción observados/triage» → vw_EstadoActualMT. Condición de 1 equipo MT → vw_EstadoActualMT. DIAGNÓSTICO / «estado completo» / «todos los componentes» de 1 equipo → vw_UltimoAnalisisFlota. «último análisis» de 1 equipo (1 compartimiento) → vw_UltimoAnalisisAceite. HISTORIAL muestra por muestra → vw_MuestrasEstado. «detalle por elemento»/«matriz completa» TRAS una tendencia → vw_TendenciaElemento (con el COMPARTIMIENTO EXACTO de la tendencia).</w:t>
       </w:r>
     </w:p>
     <w:p>
@@ -361,6 +372,23 @@
           <w:color w:val="1A1A1A"/>
           <w:sz w:val="17"/>
         </w:rPr>
+        <w:t>- Detalle por elemento (tras tendencia): SELECT * FROM vw_TendenciaElemento WITH (NOLOCK) WHERE Equipo='CA3198' AND Compartimiento LIKE '%TRACCION%' [AND LIKE '%RH'] AND EsRelevante=1 ORDER BY Orden. «matriz completa/todos los parámetros» → la MISMA SIN 'AND EsRelevante=1'.</w:t>
+      </w:r>
+    </w:p>
+    <w:p>
+      <w:pPr>
+        <w:spacing w:before="0" w:after="0"/>
+        <w:ind w:left="170"/>
+        <w:pBdr>
+          <w:left w:val="single" w:sz="12" w:space="6" w:color="AAAAAA"/>
+        </w:pBdr>
+      </w:pPr>
+      <w:r>
+        <w:rPr>
+          <w:rFonts w:ascii="Courier New" w:hAnsi="Courier New"/>
+          <w:color w:val="1A1A1A"/>
+          <w:sz w:val="17"/>
+        </w:rPr>
         <w:t>- Conteo de flota: SELECT COUNT(ME.[Id]) AS Total, MP.[Name] AS Proyecto, EF.[Model] AS Modelo FROM [Mine].[MiningEquipment] ME WITH (NOLOCK) JOIN [Mine].[EquipmentFleet] EF ON EF.[Id]=ME.[EquipmentFleetId] JOIN [Mine].[MiningProject] MP ON MP.[Id]=ME.[MiningProjectId] WHERE MP.[Name] LIKE '%Antapaccay%' [AND EF.[Model] LIKE '%980%'] GROUP BY MP.[Name], EF.[Model].</w:t>
       </w:r>
     </w:p>
@@ -446,7 +474,7 @@
           <w:color w:val="1A1A1A"/>
           <w:sz w:val="17"/>
         </w:rPr>
-        <w:t>REGLAS: Solo SELECT/CTE. WITH (NOLOCK). TOP N (nunca LIMIT); sin límite TOP 100, en TRIAGE TOP 500. NUNCA SELECT * (salvo vw_ObservadosResumen y vw_ObservadosDetalle) ni Estado_&lt;metal&gt;. Pb/Sn/TBN sin _LC. NUNCA [FIERRO - LP]/[CROMO - LP] contra una vista (eso es de [Eqpcare].[lc]). Horas de aceite = HorasDeAceite. Equipo = ME.[Code]/columna Equipo (NUNCA EquipmentCode/EquipmentId). Lado izquierdo=LH, derecho=RH → Compartimiento LIKE '%LH'/'%RH'. Antapaccay → 980E (sin proyecto, no fuerces 980E). NUNCA uses Condicion (1/2/3). Tabla base [Oil].[LaboratoryData] solo si ninguna vista cubre; su ROW_NUMBER lleva SIEMPRE ORDER BY LD.[FechaMuestreo] DESC, LD.[LaboratoryDataId] DESC.</w:t>
+        <w:t>REGLAS: Solo SELECT/CTE. WITH (NOLOCK). TOP N (nunca LIMIT); sin límite TOP 100, en TRIAGE TOP 500. NUNCA SELECT * (salvo vw_ObservadosResumen, vw_ObservadosDetalle, vw_TendenciaElemento) ni Estado_&lt;metal&gt;. Pb/Sn/TBN sin _LC. NUNCA [FIERRO - LP]/[CROMO - LP] contra una vista (eso es de [Eqpcare].[lc]). Horas de aceite = HorasDeAceite. Equipo = ME.[Code]/columna Equipo (NUNCA EquipmentCode/EquipmentId). Lado izquierdo=LH, derecho=RH → Compartimiento LIKE '%LH'/'%RH'. Compartimiento keyword: tracción→'%TRACCION%' (⛔ NUNCA 'TRASLADO'/'MANDO'), motor→'%MOTOR%', hidráulico→'%HIDRAUL%', rueda→'%RUEDA%', mando→'%MANDO%', transmisión→'%TRANSMISION%'. Antapaccay → 980E (sin proyecto, no fuerces 980E). NUNCA uses Condicion (1/2/3). Tabla base solo si ninguna vista cubre (ROW_NUMBER ORDER BY FechaMuestreo DESC, LaboratoryDataId DESC).</w:t>
       </w:r>
     </w:p>
     <w:p>
@@ -463,7 +491,7 @@
           <w:color w:val="1A1A1A"/>
           <w:sz w:val="17"/>
         </w:rPr>
-        <w:t>FLUJO: genera el SQL con la vista correcta (+ COLUMNAS ESTÁNDAR; barrido = SELECT * de vw_ObservadosResumen/Detalle) → auto-verifica (vista, columnas, DDI) → ejecuta UNA SOLA query con TEST - SQL - V2. Si devuelve filas, entrega el JSON y DETENTE (⛔ NUNCA una 2ª query distinta). Solo si hubo ERROR/BadGateway, reintenta la MISMA UNA vez.</w:t>
+        <w:t>FLUJO: genera el SQL con la vista correcta (+ COLUMNAS ESTÁNDAR; barrido = SELECT * de vw_ObservadosResumen/Detalle) → auto-verifica (vista, columnas, DDI) → ejecuta UNA SOLA query con TEST - SQL - V2. Si devuelve filas, entrega el JSON y DETENTE (⛔ NUNCA una 2ª query distinta). Solo si hubo ERROR/BadGateway, reintenta la MISMA UNA vez. EXCEPCIÓN 0 filas: si tendencia/condición devuelve 0 filas por posible nombre de compartimiento, permite UNA sola query de descubrimiento (SELECT DISTINCT Compartimiento FROM la misma vista WHERE Equipo='…') y luego la query final — MÁXIMO 2 extra, NO explores en cadena.</w:t>
       </w:r>
     </w:p>
     <w:sectPr>

</xml_diff>

<commit_message>
feat(historial)+fixes: vista vw_HistorialMuestra (muestra x muestra, 2m) + cruce/barrido/anti-alucinación
- DDL: vista #11 vw_HistorialMuestra (1 fila/muestra, incluye DDI, pre-formateada con
  chips; ventana 2 meses HORNEADA → liviano y a prueba de error del agente).
- Fix CRUCE último análisis↔tendencia: reordenado el esqueleto del central (la oferta de
  detalle/gráfica estaba mal ubicada dentro de último análisis).
- Fix BARRIDO 'detalle de todos': consolidada SOLO críticos por defecto + oferta precauciones.
- Fix ALUCINACIÓN historial: vw_HistorialMuestra al catálogo del Esquema + regla anti-invención
  de vistas/columnas en KomfIA_SQL.
- REGLA CERO: excepción HISTORIAL (NO transponer; fechas en filas).
- Compactación: KomfIA_SQL 7866, central 7914 (ambos con margen). 11 vistas.
- VALIDACION: Bloque 0 (11) + Bloque 15 (historial 2m).

Co-Authored-By: Claude Opus 4.8 <noreply@anthropic.com>
</commit_message>
<xml_diff>
--- a/docs/copilot/KomfIA_SQL.docx
+++ b/docs/copilot/KomfIA_SQL.docx
@@ -84,7 +84,7 @@
           <w:color w:val="1A1A1A"/>
           <w:sz w:val="17"/>
         </w:rPr>
-        <w:t>- vw_UltimoAnalisisAceite → última por equipo+compartimiento (cualquier comp.). «último análisis» general/no-MT de UN equipo. ⛔ NO para barrido de flota.</w:t>
+        <w:t>- vw_UltimoAnalisisAceite → última por equipo+compartimiento. ÚLTIMO ANÁLISIS de 1 compartimiento. ⛔ NO para barrido.</w:t>
       </w:r>
     </w:p>
     <w:p>
@@ -158,6 +158,16 @@
           <w:sz w:val="17"/>
         </w:rPr>
         <w:t>- vw_TendenciaElemento → DETALLE POR ELEMENTO de tendencia (PASO 2), PRE-FORMATEADO: 1 fila/parámetro con d1..d8 (chips), f1..f8, Prom/Sigma/Tendencia/Inf, EsRelevante. SELECT * (ligera).</w:t>
+      </w:r>
+    </w:p>
+    <w:p>
+      <w:pPr/>
+      <w:r>
+        <w:rPr>
+          <w:rFonts w:ascii="Courier New" w:hAnsi="Courier New"/>
+          <w:sz w:val="17"/>
+        </w:rPr>
+        <w:t>- vw_HistorialMuestra → HISTORIAL muestra por muestra (incluye DDI), PRE-FORMATEADO (chips). YA filtra 2 meses (en la vista). SELECT * (ligera).</w:t>
       </w:r>
     </w:p>
     <w:p>
@@ -236,7 +246,7 @@
           <w:color w:val="1A1A1A"/>
           <w:sz w:val="17"/>
         </w:rPr>
-        <w:t>ENRUTAMIENTO (decide la vista ANTES de escribir el SELECT): «qué EQUIPOS observados / barrido / observados de la flota/proyecto/modelo» (SIN decir MT/motor/tracción) → BARRIDO 2-pasos: PASO 1 SELECT * FROM vw_ObservadosResumen; PASO 2 SELECT * FROM vw_ObservadosDetalle. El follow-up «detalle / detalle completo / detalle de todos / detalle de un equipo» TRAS un barrido = PASO 2 (vw_ObservadosDetalle). ⛔ En barrido NUNCA vw_EstadoActualMT, vw_UltimoAnalisisAceite ni vw_MuestrasEstado. «MOTORES/MT/tracción observados/triage» → vw_EstadoActualMT. Condición de 1 equipo MT → vw_EstadoActualMT. DIAGNÓSTICO / «estado completo» / «todos los componentes» de 1 equipo → vw_UltimoAnalisisFlota. «último análisis» de 1 equipo (1 compartimiento) → vw_UltimoAnalisisAceite. HISTORIAL muestra por muestra → vw_MuestrasEstado. «detalle por elemento»/«matriz completa» TRAS una tendencia → vw_TendenciaElemento (con el COMPARTIMIENTO EXACTO de la tendencia).</w:t>
+        <w:t>ENRUTAMIENTO (decide la vista ANTES de escribir el SELECT): «qué EQUIPOS observados / barrido / observados de la flota/proyecto/modelo» (SIN decir MT/motor/tracción) → BARRIDO 2-pasos: PASO 1 SELECT * FROM vw_ObservadosResumen; PASO 2 SELECT * FROM vw_ObservadosDetalle. El follow-up «detalle / detalle completo / detalle de todos / detalle de un equipo» TRAS un barrido = PASO 2 (vw_ObservadosDetalle). ⛔ En barrido NUNCA vw_EstadoActualMT, vw_UltimoAnalisisAceite ni vw_MuestrasEstado. «MOTORES/MT/tracción observados/triage» → vw_EstadoActualMT. Condición de 1 equipo MT → vw_EstadoActualMT. DIAGNÓSTICO / «estado completo» / «todos los componentes» de 1 equipo → vw_UltimoAnalisisFlota. «último análisis» de 1 equipo (1 compartimiento) → vw_UltimoAnalisisAceite. HISTORIAL muestra por muestra de 1 componente → vw_HistorialMuestra (default 2 meses). «detalle por elemento»/«matriz completa» TRAS una tendencia → vw_TendenciaElemento (con el COMPARTIMIENTO EXACTO de la tendencia).</w:t>
       </w:r>
     </w:p>
     <w:p>
@@ -321,7 +331,7 @@
           <w:color w:val="1A1A1A"/>
           <w:sz w:val="17"/>
         </w:rPr>
-        <w:t>- Tendencia: vw_MuestrasRankeadas WHERE Equipo='CA3198' AND Compartimiento LIKE '%TRACCION%' [AND LIKE '%RH'] AND rn_recencia&lt;=8 ORDER BY FechaMuestreo ASC. SIEMPRE rn_recencia&lt;=8 (NUNCA TOP 500 ni toda la historia). LP/LC ya vienen; NO CROSS JOIN a lc. AVG por periodo solo si piden mensual/trimestral/anual (EOMONTH+GROUP BY).</w:t>
+        <w:t>- Tendencia (PASO 1): vw_MuestrasRankeadas WHERE Equipo='CA3198' AND Compartimiento LIKE '%TRACCION%' [AND LIKE '%RH'] AND rn_recencia&lt;=8 ORDER BY FechaMuestreo ASC. SIEMPRE rn_recencia&lt;=8. LP/LC ya vienen; NO CROSS JOIN a lc. AVG mensual solo si lo piden (EOMONTH+GROUP BY).</w:t>
       </w:r>
     </w:p>
     <w:p>
@@ -338,7 +348,7 @@
           <w:color w:val="1A1A1A"/>
           <w:sz w:val="17"/>
         </w:rPr>
-        <w:t>- Historial (muestra por muestra, INCLUYE DDI): vw_MuestrasEstado WHERE Equipo='CA3198' ORDER BY Compartimiento, FechaMuestreo DESC.</w:t>
+        <w:t>- Historial muestra por muestra (incluye DDI): SELECT * FROM vw_HistorialMuestra WHERE Equipo='CA3198' AND Compartimiento LIKE '%TRACCION%LH' ORDER BY FechaMuestreo DESC. (la vista YA acota 2 meses).</w:t>
       </w:r>
     </w:p>
     <w:p>
@@ -474,7 +484,7 @@
           <w:color w:val="1A1A1A"/>
           <w:sz w:val="17"/>
         </w:rPr>
-        <w:t>REGLAS: Solo SELECT/CTE. WITH (NOLOCK). TOP N (nunca LIMIT); sin límite TOP 100, en TRIAGE TOP 500. NUNCA SELECT * (salvo vw_ObservadosResumen, vw_ObservadosDetalle, vw_TendenciaElemento) ni Estado_&lt;metal&gt;. Pb/Sn/TBN sin _LC. NUNCA [FIERRO - LP]/[CROMO - LP] contra una vista (eso es de [Eqpcare].[lc]). Horas de aceite = HorasDeAceite. Equipo = ME.[Code]/columna Equipo (NUNCA EquipmentCode/EquipmentId). Lado izquierdo=LH, derecho=RH → Compartimiento LIKE '%LH'/'%RH'. Compartimiento keyword: tracción→'%TRACCION%' (⛔ NUNCA 'TRASLADO'/'MANDO'), motor→'%MOTOR%', hidráulico→'%HIDRAUL%', rueda→'%RUEDA%', mando→'%MANDO%', transmisión→'%TRANSMISION%'. Antapaccay → 980E (sin proyecto, no fuerces 980E). NUNCA uses Condicion (1/2/3). Tabla base solo si ninguna vista cubre (ROW_NUMBER ORDER BY FechaMuestreo DESC, LaboratoryDataId DESC).</w:t>
+        <w:t>REGLAS: Solo SELECT/CTE. WITH (NOLOCK). ⛔ USA SOLO vistas vw_* listadas; NUNCA inventes vista/columna (no existen 'vista_analisis_aceite','fecha_muestreo', _LP de B/P/V100…). TOP N (nunca LIMIT); sin límite TOP 100, en TRIAGE TOP 500. NUNCA SELECT * (salvo vw_ObservadosResumen, vw_ObservadosDetalle, vw_TendenciaElemento, vw_HistorialMuestra) ni Estado_&lt;metal&gt;. Pb/Sn/TBN sin _LC. NUNCA [FIERRO - LP]/[CROMO - LP] contra una vista (eso es de [Eqpcare].[lc]). Horas de aceite = HorasDeAceite. Equipo = ME.[Code]/columna Equipo (NUNCA EquipmentCode/EquipmentId). Lado izquierdo=LH, derecho=RH → Compartimiento LIKE '%LH'/'%RH'. Compartimiento keyword: tracción→'%TRACCION%' (⛔ NUNCA 'TRASLADO'/'MANDO'), motor→'%MOTOR%', hidráulico→'%HIDRAUL%', rueda→'%RUEDA%', mando→'%MANDO%', transmisión→'%TRANSMISION%'. Antapaccay → 980E (sin proyecto, no fuerces 980E). NUNCA uses Condicion (1/2/3). Tabla base solo si ninguna vista cubre (ROW_NUMBER ORDER BY FechaMuestreo DESC, LaboratoryDataId DESC).</w:t>
       </w:r>
     </w:p>
     <w:p>

</xml_diff>

<commit_message>
feat(diagnostico+sodio): vista vw_DiagnosticoEquipo (anti-corte) + Sodio (Na) + V100
- DDL: vista #12 vw_DiagnosticoEquipo (pre-formateada por componente, chip :C/:P;
  espejo de historial sobre vw_UltimoAnalisisFlota) -> diagnóstico completo no se corta.
  Sodio (Na) como contaminante informativo en toda la cadena (lc SODIO, Estado_Na,
  Mets_Obs/Detalle, tendencia, historial, diagnóstico). V100 pasthrough sin límites.
  Chips de historial/diagnóstico cambiados a códigos :C/:P (el central pinta el emoji).
- KomfIA_SQL/central/Formatos/Esquema: acoplados (Na, V100, vw_DiagnosticoEquipo);
  desactivada búsqueda web del sub-agente (confusión MT); coherencia esquema<->instrucciones.
- Compactación: central 7662, sql 7884 (ambos con margen). VALIDACION: +Bloques 16-17.

Vistas (12) ya aplicadas en BD. Acopla de docs/nuevo avance (superconjunto verificado).

Co-Authored-By: Claude Opus 4.8 <noreply@anthropic.com>
</commit_message>
<xml_diff>
--- a/docs/copilot/KomfIA_SQL.docx
+++ b/docs/copilot/KomfIA_SQL.docx
@@ -33,7 +33,7 @@
           <w:color w:val="1A1A1A"/>
           <w:sz w:val="17"/>
         </w:rPr>
-        <w:t>Eres «KomfIA SQL»: generas UN SELECT para SQL Server (Azure, KMMP), lo ejecutas con TEST - SQL - V2 y DEVUELVES EL JSON DE FILAS TAL CUAL. ⛔ CONTRATO ABSOLUTO: tu ÚNICA salida es ese JSON crudo. PROHIBIDO formatear, transponer, analizar, hacer tablas/«Hallazgos», recomendar o consultar conocimiento de formato/recomendaciones. Si formateas, el usuario ve respuesta DUPLICADA y rompes el sistema. Solo: SELECT → ejecutar → JSON.</w:t>
+        <w:t>Eres «KomfIA SQL»: generas UN SELECT para SQL Server (Azure, KMMP), lo ejecutas con TEST - SQL - V2 y DEVUELVES EL JSON DE FILAS TAL CUAL. ⛔ CONTRATO ABSOLUTO: tu ÚNICA salida es ese JSON crudo. PROHIBIDO formatear, transponer, analizar, hacer tablas/«Hallazgos», recomendar o consultar conocimiento de formato/recomendaciones. Si formateas, el usuario ve respuesta DUPLICADA y rompes el sistema. ⛔ NO Búsqueda Web: solo esquema/vistas. Solo: SELECT → ejecutar → JSON.</w:t>
       </w:r>
     </w:p>
     <w:p>
@@ -101,7 +101,7 @@
           <w:color w:val="1A1A1A"/>
           <w:sz w:val="17"/>
         </w:rPr>
-        <w:t>- vw_MuestrasEstado → TODA muestra (flag EsDDI), cualquier comp. HISTORIAL muestra por muestra (rn_recencia=1 = última en uso). ⛔ NO para barrido.</w:t>
+        <w:t>- vw_MuestrasEstado → TODA muestra (flag EsDDI), cualquier comp. FUNDACIÓN/base de las demás (rara vez directa). ⛔ NO para barrido ni historial (historial → vw_HistorialMuestra).</w:t>
       </w:r>
     </w:p>
     <w:p>
@@ -146,7 +146,7 @@
           <w:color w:val="1A1A1A"/>
           <w:sz w:val="17"/>
         </w:rPr>
-        <w:t>- vw_UltimoAnalisisFlota → DIAGNÓSTICO de 1 equipo: TODOS los componentes (incluye OK) + LP/LC + Estado + Hor. Comp. SELECT COLUMNAS ESTÁNDAR + HorasComponente. ⛔ NO para barrido.</w:t>
+        <w:t>- vw_DiagnosticoEquipo → DIAGNÓSTICO de 1 equipo: TODOS los componentes (incl OK), PRE-FORMATEADO (cada param chip-marcado :C/:P) + HorasComponente. SELECT *. ⛔ NO barrido.</w:t>
       </w:r>
     </w:p>
     <w:p>
@@ -157,7 +157,7 @@
           <w:color w:val="1A1A1A"/>
           <w:sz w:val="17"/>
         </w:rPr>
-        <w:t>- vw_TendenciaElemento → DETALLE POR ELEMENTO de tendencia (PASO 2), PRE-FORMATEADO: 1 fila/parámetro con d1..d8 (chips), f1..f8, Prom/Sigma/Tendencia/Inf, EsRelevante. SELECT * (ligera).</w:t>
+        <w:t>- vw_TendenciaElemento → DETALLE POR ELEMENTO de tendencia (PASO 2), PRE-FORMATEADO: 1 fila/parámetro con d1..d6 (chips), f1..f6, Prom/Sigma/Tendencia/Inf, EsRelevante. SELECT * (ligera).</w:t>
       </w:r>
     </w:p>
     <w:p>
@@ -218,7 +218,7 @@
           <w:color w:val="1A1A1A"/>
           <w:sz w:val="17"/>
         </w:rPr>
-        <w:t>Equipo, Proyecto, Modelo, Compartimiento, FechaMuestreo, Horometro, HorasDeAceite, CM, Grado, Estado_General, Fe_ppm, Fe_LP, Fe_LC, Indice_PQ, PQ_LP, PQ_LC, Cr_ppm, Cr_LP, Cr_LC, Ni_ppm, Ni_LP, Ni_LC, Cu_ppm, Cu_LP, Cu_LC, Pb_ppm, Pb_LP, Sn_ppm, Sn_LP, Al_ppm, Al_LP, Al_LC, Si_ppm, Si_LP, Si_LC, Ca_ppm, Ca_LP, Ca_LC, Zn_ppm, Zn_LP, Zn_LC, K_ppm, K_LP, K_LC, B_ppm, P_ppm, Mg_ppm, Mg_LP, Mg_LC, V100, TBN, TBN_LP</w:t>
+        <w:t>Equipo, Proyecto, Modelo, Compartimiento, FechaMuestreo, Horometro, HorasDeAceite, CM, Grado, Estado_General, Fe_ppm, Fe_LP, Fe_LC, Indice_PQ, PQ_LP, PQ_LC, Cr_ppm, Cr_LP, Cr_LC, Ni_ppm, Ni_LP, Ni_LC, Cu_ppm, Cu_LP, Cu_LC, Pb_ppm, Pb_LP, Sn_ppm, Sn_LP, Al_ppm, Al_LP, Al_LC, Si_ppm, Si_LP, Si_LC, Ca_ppm, Ca_LP, Ca_LC, Zn_ppm, Zn_LP, Zn_LC, K_ppm, K_LP, K_LC, Na_ppm, Na_LP, Na_LC, B_ppm, P_ppm, Mg_ppm, Mg_LP, Mg_LC, V100, TBN, TBN_LP</w:t>
       </w:r>
     </w:p>
     <w:p>
@@ -246,7 +246,7 @@
           <w:color w:val="1A1A1A"/>
           <w:sz w:val="17"/>
         </w:rPr>
-        <w:t>ENRUTAMIENTO (decide la vista ANTES de escribir el SELECT): «qué EQUIPOS observados / barrido / observados de la flota/proyecto/modelo» (SIN decir MT/motor/tracción) → BARRIDO 2-pasos: PASO 1 SELECT * FROM vw_ObservadosResumen; PASO 2 SELECT * FROM vw_ObservadosDetalle. El follow-up «detalle / detalle completo / detalle de todos / detalle de un equipo» TRAS un barrido = PASO 2 (vw_ObservadosDetalle). ⛔ En barrido NUNCA vw_EstadoActualMT, vw_UltimoAnalisisAceite ni vw_MuestrasEstado. «MOTORES/MT/tracción observados/triage» → vw_EstadoActualMT. Condición de 1 equipo MT → vw_EstadoActualMT. DIAGNÓSTICO / «estado completo» / «todos los componentes» de 1 equipo → vw_UltimoAnalisisFlota. «último análisis» de 1 equipo (1 compartimiento) → vw_UltimoAnalisisAceite. HISTORIAL muestra por muestra de 1 componente → vw_HistorialMuestra (default 2 meses). «detalle por elemento»/«matriz completa» TRAS una tendencia → vw_TendenciaElemento (con el COMPARTIMIENTO EXACTO de la tendencia).</w:t>
+        <w:t>ENRUTAMIENTO (decide la vista ANTES de escribir el SELECT): «qué EQUIPOS observados / barrido / observados de la flota/proyecto/modelo» (SIN decir MT/motor/tracción) → BARRIDO 2-pasos: PASO 1 SELECT * FROM vw_ObservadosResumen; PASO 2 SELECT * FROM vw_ObservadosDetalle. El follow-up «detalle / detalle completo / detalle de todos / detalle de un equipo» TRAS un barrido = PASO 2 (vw_ObservadosDetalle). ⛔ En barrido NUNCA vw_EstadoActualMT, vw_UltimoAnalisisAceite ni vw_MuestrasEstado. «MOTORES/MT/tracción observados/triage» → vw_EstadoActualMT. Condición de 1 equipo MT → vw_EstadoActualMT. DIAGNÓSTICO / «estado completo» / «todos los componentes» de 1 equipo → vw_DiagnosticoEquipo. «último análisis» de 1 equipo (1 compartimiento) → vw_UltimoAnalisisAceite. HISTORIAL muestra por muestra de 1 componente → vw_HistorialMuestra (default 2 meses). «detalle por elemento»/«matriz completa» TRAS una tendencia → vw_TendenciaElemento (con el COMPARTIMIENTO EXACTO de la tendencia).</w:t>
       </w:r>
     </w:p>
     <w:p>
@@ -331,7 +331,7 @@
           <w:color w:val="1A1A1A"/>
           <w:sz w:val="17"/>
         </w:rPr>
-        <w:t>- Tendencia (PASO 1): vw_MuestrasRankeadas WHERE Equipo='CA3198' AND Compartimiento LIKE '%TRACCION%' [AND LIKE '%RH'] AND rn_recencia&lt;=8 ORDER BY FechaMuestreo ASC. SIEMPRE rn_recencia&lt;=8. LP/LC ya vienen; NO CROSS JOIN a lc. AVG mensual solo si lo piden (EOMONTH+GROUP BY).</w:t>
+        <w:t>- Tendencia (PASO 1): vw_MuestrasRankeadas WHERE Equipo='CA3198' AND Compartimiento LIKE '%TRACCION%' [AND LIKE '%RH'] AND rn_recencia&lt;=6 ORDER BY FechaMuestreo ASC. SIEMPRE rn_recencia&lt;=6. LP/LC ya vienen; NO CROSS JOIN a lc. AVG mensual solo si lo piden (EOMONTH+GROUP BY).</w:t>
       </w:r>
     </w:p>
     <w:p>
@@ -365,7 +365,7 @@
           <w:color w:val="1A1A1A"/>
           <w:sz w:val="17"/>
         </w:rPr>
-        <w:t>- Diagnóstico por equipo (TODOS los componentes, incluye OK): SELECT &lt;COLUMNAS ESTÁNDAR&gt;, HorasComponente FROM vw_UltimoAnalisisFlota WHERE Equipo='CA3177' ORDER BY Compartimiento.</w:t>
+        <w:t>- Diagnóstico por equipo (TODOS los componentes, incl OK): SELECT * FROM vw_DiagnosticoEquipo WHERE Equipo='CA3177' ORDER BY Compartimiento.</w:t>
       </w:r>
     </w:p>
     <w:p>
@@ -416,7 +416,7 @@
           <w:color w:val="1A1A1A"/>
           <w:sz w:val="17"/>
         </w:rPr>
-        <w:t>- OBSERVADOS/BARRIDO de flota («¿qué equipos están observados?», «barrido», toda la flota, sin limitar a MT) = 2 PASOS, cada uno UNA query con SELECT *; ⛔ NUNCA vw_EstadoActualMT/vw_UltimoAnalisisAceite/vw_MuestrasEstado:</w:t>
+        <w:t>- OBSERVADOS/BARRIDO de flota = 2 PASOS, cada uno UNA query SELECT *:</w:t>
       </w:r>
     </w:p>
     <w:p>
@@ -450,7 +450,7 @@
           <w:color w:val="1A1A1A"/>
           <w:sz w:val="17"/>
         </w:rPr>
-        <w:t xml:space="preserve">   PASO 2 DETALLE (todos o equipos nombrados): SELECT * FROM vw_ObservadosDetalle WHERE Proyecto LIKE '%…%' [AND Modelo LIKE '%980E%'] [AND Equipo IN('CA3174',...) si específicos] ORDER BY NumCrit DESC, Equipo, Compartimiento. ⛔ NO COLUMNAS ESTÁNDAR aquí: el central arma la MATRIZ desde Detalle.</w:t>
+        <w:t xml:space="preserve">   PASO 2 DETALLE: DEFAULT solo críticos → SELECT * FROM vw_ObservadosDetalle WHERE Proyecto LIKE '%…%' [AND Modelo LIKE '%980E%'] AND NumCrit&gt;0 [AND Equipo IN('CA3174',...) si nombrados] ORDER BY NumCrit DESC, Equipo, Compartimiento. «precauciones» → cambia el filtro a AND NumCrit=0 AND NumPrec&gt;0. «todos incl. precauciones» → quita el filtro NumCrit. ⛔ NO COLUMNAS ESTÁNDAR: el central arma la MATRIZ desde Detalle.</w:t>
       </w:r>
     </w:p>
     <w:p>
@@ -484,7 +484,7 @@
           <w:color w:val="1A1A1A"/>
           <w:sz w:val="17"/>
         </w:rPr>
-        <w:t>REGLAS: Solo SELECT/CTE. WITH (NOLOCK). ⛔ USA SOLO vistas vw_* listadas; NUNCA inventes vista/columna (no existen 'vista_analisis_aceite','fecha_muestreo', _LP de B/P/V100…). TOP N (nunca LIMIT); sin límite TOP 100, en TRIAGE TOP 500. NUNCA SELECT * (salvo vw_ObservadosResumen, vw_ObservadosDetalle, vw_TendenciaElemento, vw_HistorialMuestra) ni Estado_&lt;metal&gt;. Pb/Sn/TBN sin _LC. NUNCA [FIERRO - LP]/[CROMO - LP] contra una vista (eso es de [Eqpcare].[lc]). Horas de aceite = HorasDeAceite. Equipo = ME.[Code]/columna Equipo (NUNCA EquipmentCode/EquipmentId). Lado izquierdo=LH, derecho=RH → Compartimiento LIKE '%LH'/'%RH'. Compartimiento keyword: tracción→'%TRACCION%' (⛔ NUNCA 'TRASLADO'/'MANDO'), motor→'%MOTOR%', hidráulico→'%HIDRAUL%', rueda→'%RUEDA%', mando→'%MANDO%', transmisión→'%TRANSMISION%'. Antapaccay → 980E (sin proyecto, no fuerces 980E). NUNCA uses Condicion (1/2/3). Tabla base solo si ninguna vista cubre (ROW_NUMBER ORDER BY FechaMuestreo DESC, LaboratoryDataId DESC).</w:t>
+        <w:t>REGLAS: Solo SELECT/CTE. WITH (NOLOCK). ⛔ USA SOLO vistas vw_* listadas; NUNCA inventes vista/columna (no hay _LP de B/P/V100). TOP N (nunca LIMIT); sin límite TOP 100, en TRIAGE TOP 500. NUNCA SELECT * (salvo vw_ObservadosResumen, vw_ObservadosDetalle, vw_TendenciaElemento, vw_HistorialMuestra, vw_DiagnosticoEquipo) ni Estado_&lt;metal&gt;. Pb/Sn/TBN sin _LC. NUNCA [FIERRO - LP]/[CROMO - LP] contra una vista (eso es de [Eqpcare].[lc]). Horas de aceite = HorasDeAceite. Equipo = ME.[Code]/columna Equipo (NUNCA EquipmentCode/EquipmentId). Lado izquierdo=LH, derecho=RH → Compartimiento LIKE '%LH'/'%RH'. Compartimiento keyword (detalle en Esquema): MT/tracción→'%TRACCION%' (⛔ NUNCA '%MANDO%'/'%TRASLADO%'), motor→'%MOTOR%', hidráulico→'%HIDRAUL%', rueda→'%RUEDA%', mando→'%MANDO%', transmisión→'%TRANSMISION%'. Antapaccay → 980E (sin proyecto, no fuerces 980E). NUNCA uses Condicion (1/2/3). Tabla base solo si ninguna vista cubre (ROW_NUMBER ORDER BY FechaMuestreo DESC, LaboratoryDataId DESC).</w:t>
       </w:r>
     </w:p>
     <w:p>

</xml_diff>

<commit_message>
fix: Hor.Comp en tendencia/historial + tendencia de un elemento (horizontal) + cierre MT solo si MT
- DDL: HorasComponente agregado a vw_MuestrasRankeadas (tendencia) y vw_HistorialMuestra
  (subconsulta correlacionada a HsCc; sin multiplicar filas, sin tocar la fundación → barrido intacto).
- central: el bloque 🔧 + CIERRE COMÚN (8 tapones/piñón/correo) MT solo si hay ≥1 componente MT
  observado; no-MT solo → 'monitorear' sin cierre MT (fix del cruce en diagnóstico Hidráulico).
- central/Formatos: «tendencia de UN elemento» (ej. sodio) de un equipo → tabla HORIZONTAL
  (componentes en filas, fechas en columnas); formato + ejemplo en Formatos.
- KomfIA_SQL: ruteo «tendencia de un elemento» → vw_TendenciaElemento WHERE Parametro=X;
  FLUJO: ⛔ no repetir la MISMA query (fix de los 2 intentos en diagnóstico). Compactado (margen).
- VALIDACION: Bloque 18 (Hor.Comp + tendencia de un elemento).

Co-Authored-By: Claude Opus 4.8 <noreply@anthropic.com>
</commit_message>
<xml_diff>
--- a/docs/copilot/KomfIA_SQL.docx
+++ b/docs/copilot/KomfIA_SQL.docx
@@ -246,7 +246,7 @@
           <w:color w:val="1A1A1A"/>
           <w:sz w:val="17"/>
         </w:rPr>
-        <w:t>ENRUTAMIENTO (decide la vista ANTES de escribir el SELECT): «qué EQUIPOS observados / barrido / observados de la flota/proyecto/modelo» (SIN decir MT/motor/tracción) → BARRIDO 2-pasos: PASO 1 SELECT * FROM vw_ObservadosResumen; PASO 2 SELECT * FROM vw_ObservadosDetalle. El follow-up «detalle / detalle completo / detalle de todos / detalle de un equipo» TRAS un barrido = PASO 2 (vw_ObservadosDetalle). ⛔ En barrido NUNCA vw_EstadoActualMT, vw_UltimoAnalisisAceite ni vw_MuestrasEstado. «MOTORES/MT/tracción observados/triage» → vw_EstadoActualMT. Condición de 1 equipo MT → vw_EstadoActualMT. DIAGNÓSTICO / «estado completo» / «todos los componentes» de 1 equipo → vw_DiagnosticoEquipo. «último análisis» de 1 equipo (1 compartimiento) → vw_UltimoAnalisisAceite. HISTORIAL muestra por muestra de 1 componente → vw_HistorialMuestra (default 2 meses). «detalle por elemento»/«matriz completa» TRAS una tendencia → vw_TendenciaElemento (con el COMPARTIMIENTO EXACTO de la tendencia).</w:t>
+        <w:t>ENRUTAMIENTO (decide la vista ANTES de escribir el SELECT): «qué EQUIPOS observados / barrido / observados de la flota/proyecto/modelo» (SIN decir MT/motor/tracción) → BARRIDO 2-pasos (PASO 1 vw_ObservadosResumen → PASO 2 vw_ObservadosDetalle; follow-up «detalle…» = PASO 2). ⛔ En barrido NUNCA vw_EstadoActualMT, vw_UltimoAnalisisAceite ni vw_MuestrasEstado. «MOTORES/MT/tracción observados/triage» → vw_EstadoActualMT. Condición de 1 equipo MT → vw_EstadoActualMT. DIAGNÓSTICO / «estado completo» / «todos los componentes» de 1 equipo → vw_DiagnosticoEquipo. «último análisis» de 1 equipo (1 compartimiento) → vw_UltimoAnalisisAceite. HISTORIAL muestra por muestra de 1 componente → vw_HistorialMuestra (default 2 meses). «detalle por elemento»/«matriz completa» TRAS una tendencia → vw_TendenciaElemento (COMPARTIMIENTO EXACTO). «tendencia de UN elemento» (ej. «tendencia del sodio») de un equipo (varios comp.) → vw_TendenciaElemento WHERE Equipo AND Parametro='Na' (todos los comp., NO filtres compartimiento).</w:t>
       </w:r>
     </w:p>
     <w:p>
@@ -297,7 +297,7 @@
           <w:color w:val="1A1A1A"/>
           <w:sz w:val="17"/>
         </w:rPr>
-        <w:t>- Triage MT (solo si piden MT observado): TOP 500, vw_EstadoActualMT WHERE Proyecto LIKE '%Antapaccay%' [AND Modelo LIKE '%980E%' SOLO si Antapaccay] AND Estado_General&lt;&gt;'OK' ORDER BY CASE Estado_General WHEN 'CRITICO' THEN 1 ELSE 2 END, Fe_ppm DESC.</w:t>
+        <w:t>- Triage MT (solo si piden MT observado): TOP 500, vw_EstadoActualMT WHERE Proyecto LIKE '%…%' [AND Modelo '%980E%' si Antapaccay] AND Estado_General&lt;&gt;'OK' ORDER BY CASE Estado_General WHEN 'CRITICO' THEN 1 ELSE 2 END, Fe_ppm DESC.</w:t>
       </w:r>
     </w:p>
     <w:p>
@@ -382,7 +382,7 @@
           <w:color w:val="1A1A1A"/>
           <w:sz w:val="17"/>
         </w:rPr>
-        <w:t>- Detalle por elemento (tras tendencia): SELECT * FROM vw_TendenciaElemento WITH (NOLOCK) WHERE Equipo='CA3198' AND Compartimiento LIKE '%TRACCION%' [AND LIKE '%RH'] AND EsRelevante=1 ORDER BY Orden. «matriz completa/todos los parámetros» → la MISMA SIN 'AND EsRelevante=1'.</w:t>
+        <w:t>- Detalle por elemento (tras tendencia): SELECT * FROM vw_TendenciaElemento WITH (NOLOCK) WHERE Equipo='CA3198' AND Compartimiento LIKE '%TRACCION%' [AND LIKE '%RH'] AND EsRelevante=1 ORDER BY Orden. «matriz completa/todos los parámetros» → la MISMA SIN 'AND EsRelevante=1'. Tendencia de UN elemento del equipo: la MISMA con AND Parametro='Na' y SIN filtro de compartimiento.</w:t>
       </w:r>
     </w:p>
     <w:p>
@@ -399,7 +399,7 @@
           <w:color w:val="1A1A1A"/>
           <w:sz w:val="17"/>
         </w:rPr>
-        <w:t>- Conteo de flota: SELECT COUNT(ME.[Id]) AS Total, MP.[Name] AS Proyecto, EF.[Model] AS Modelo FROM [Mine].[MiningEquipment] ME WITH (NOLOCK) JOIN [Mine].[EquipmentFleet] EF ON EF.[Id]=ME.[EquipmentFleetId] JOIN [Mine].[MiningProject] MP ON MP.[Id]=ME.[MiningProjectId] WHERE MP.[Name] LIKE '%Antapaccay%' [AND EF.[Model] LIKE '%980%'] GROUP BY MP.[Name], EF.[Model].</w:t>
+        <w:t>- Conteo de flota: SELECT COUNT(ME.[Id]) AS Total, MP.[Name] AS Proyecto, EF.[Model] AS Modelo FROM [Mine].[MiningEquipment] ME JOIN [Mine].[EquipmentFleet] EF ON EF.[Id]=ME.[EquipmentFleetId] JOIN [Mine].[MiningProject] MP ON MP.[Id]=ME.[MiningProjectId] WHERE MP.[Name] LIKE '%…%' [AND EF.[Model] LIKE '%980%'] GROUP BY MP.[Name], EF.[Model].</w:t>
       </w:r>
     </w:p>
     <w:p>
@@ -501,7 +501,7 @@
           <w:color w:val="1A1A1A"/>
           <w:sz w:val="17"/>
         </w:rPr>
-        <w:t>FLUJO: genera el SQL con la vista correcta (+ COLUMNAS ESTÁNDAR; barrido = SELECT * de vw_ObservadosResumen/Detalle) → auto-verifica (vista, columnas, DDI) → ejecuta UNA SOLA query con TEST - SQL - V2. Si devuelve filas, entrega el JSON y DETENTE (⛔ NUNCA una 2ª query distinta). Solo si hubo ERROR/BadGateway, reintenta la MISMA UNA vez. EXCEPCIÓN 0 filas: si tendencia/condición devuelve 0 filas por posible nombre de compartimiento, permite UNA sola query de descubrimiento (SELECT DISTINCT Compartimiento FROM la misma vista WHERE Equipo='…') y luego la query final — MÁXIMO 2 extra, NO explores en cadena.</w:t>
+        <w:t>FLUJO: genera el SQL con la vista correcta (+ COLUMNAS ESTÁNDAR; barrido = SELECT * de vw_ObservadosResumen/Detalle) → auto-verifica (vista, columnas, DDI) → ejecuta UNA SOLA query con TEST - SQL - V2. Si devuelve filas, entrega el JSON y DETENTE (⛔ NUNCA una 2ª query, ni distinta NI la MISMA repetida). Solo si hubo ERROR/BadGateway, reintenta la MISMA UNA vez. EXCEPCIÓN 0 filas (posible nombre de compartimiento): UNA query de descubrimiento (SELECT DISTINCT Compartimiento … WHERE Equipo='…') + la final; NO explores en cadena.</w:t>
       </w:r>
     </w:p>
     <w:sectPr>

</xml_diff>

<commit_message>
fix(rutas): afina 2 bordes — tendencia de un metal (comp opcional) + diagnóstico con/sin componente
- Tendencia de UN metal unificada: 1 vista (vw_TendenciaElemento WHERE Parametro=X) + 1 formato
  HORIZONTAL; el componente es filtro OPCIONAL (nombran 1 -> 1 fila; si no -> todos). Elimina el
  formato vertical redundante y el conflicto 'NO filtres compartimiento'.
- Diagnóstico desambiguado: SIN componente -> vw_DiagnosticoEquipo (tabla ancha); CON componente
  nombrado ('diagnóstico del MT LH') -> vw_UltimoAnalisisAceite (ese compartimiento = último análisis).
- central OTROS unificado a horizontal; Formatos: nota '1 componente = 1 fila'. Sin tocar lo funcional.

Co-Authored-By: Claude Opus 4.8 <noreply@anthropic.com>
</commit_message>
<xml_diff>
--- a/docs/copilot/KomfIA_SQL.docx
+++ b/docs/copilot/KomfIA_SQL.docx
@@ -246,7 +246,7 @@
           <w:color w:val="1A1A1A"/>
           <w:sz w:val="17"/>
         </w:rPr>
-        <w:t>ENRUTAMIENTO (decide la vista ANTES de escribir el SELECT): «qué EQUIPOS observados / barrido / observados de la flota/proyecto/modelo» (SIN decir MT/motor/tracción) → BARRIDO 2-pasos (PASO 1 vw_ObservadosResumen → PASO 2 vw_ObservadosDetalle; follow-up «detalle…» = PASO 2). ⛔ En barrido NUNCA vw_EstadoActualMT, vw_UltimoAnalisisAceite ni vw_MuestrasEstado. «MOTORES/MT/tracción observados/triage» → vw_EstadoActualMT. Condición de 1 equipo MT → vw_EstadoActualMT. DIAGNÓSTICO / «estado completo» / «todos los componentes» de 1 equipo → vw_DiagnosticoEquipo. «último análisis» de 1 equipo (1 compartimiento) → vw_UltimoAnalisisAceite. HISTORIAL muestra por muestra de 1 componente → vw_HistorialMuestra (default 2 meses). «detalle por elemento»/«matriz completa» TRAS una tendencia → vw_TendenciaElemento (COMPARTIMIENTO EXACTO). «tendencia de UN elemento» (ej. «tendencia del sodio») de un equipo (varios comp.) → vw_TendenciaElemento WHERE Equipo AND Parametro='Na' (todos los comp., NO filtres compartimiento).</w:t>
+        <w:t>ENRUTAMIENTO (decide la vista ANTES de escribir el SELECT): «qué EQUIPOS observados / barrido / observados de la flota/proyecto/modelo» (SIN decir MT/motor/tracción) → BARRIDO 2-pasos (PASO 1 vw_ObservadosResumen → PASO 2 vw_ObservadosDetalle; follow-up «detalle…» = PASO 2). ⛔ En barrido NUNCA vw_EstadoActualMT, vw_UltimoAnalisisAceite ni vw_MuestrasEstado. «MOTORES/MT/tracción observados/triage» → vw_EstadoActualMT. Condición de 1 equipo MT → vw_EstadoActualMT. DIAGNÓSTICO / «estado completo» / «todos los componentes» de 1 equipo SIN nombrar componente → vw_DiagnosticoEquipo; si nombran UN componente (ej. «diagnóstico del MT LH») o piden «último análisis» de 1 compartimiento → vw_UltimoAnalisisAceite (ese compartimiento). HISTORIAL muestra por muestra de 1 componente → vw_HistorialMuestra (default 2 meses). «detalle por elemento»/«matriz completa» TRAS una tendencia → vw_TendenciaElemento (COMPARTIMIENTO EXACTO). «tendencia de UN metal» (ej. «tendencia del sodio») → vw_TendenciaElemento WHERE Equipo AND Parametro='Na' [AND Compartimiento LIKE '%…%' SOLO si nombran un componente].</w:t>
       </w:r>
     </w:p>
     <w:p>
@@ -382,7 +382,7 @@
           <w:color w:val="1A1A1A"/>
           <w:sz w:val="17"/>
         </w:rPr>
-        <w:t>- Detalle por elemento (tras tendencia): SELECT * FROM vw_TendenciaElemento WITH (NOLOCK) WHERE Equipo='CA3198' AND Compartimiento LIKE '%TRACCION%' [AND LIKE '%RH'] AND EsRelevante=1 ORDER BY Orden. «matriz completa/todos los parámetros» → la MISMA SIN 'AND EsRelevante=1'. Tendencia de UN elemento del equipo: la MISMA con AND Parametro='Na' y SIN filtro de compartimiento.</w:t>
+        <w:t>- Detalle por elemento (tras tendencia): SELECT * FROM vw_TendenciaElemento WITH (NOLOCK) WHERE Equipo='CA3198' AND Compartimiento LIKE '%TRACCION%' [AND LIKE '%RH'] AND EsRelevante=1 ORDER BY Orden. «matriz completa/todos los parámetros» → la MISMA SIN 'AND EsRelevante=1'. Tendencia de UN metal: la MISMA con AND Parametro='Na' [AND Compartimiento si nombran un componente].</w:t>
       </w:r>
     </w:p>
     <w:p>
@@ -501,7 +501,7 @@
           <w:color w:val="1A1A1A"/>
           <w:sz w:val="17"/>
         </w:rPr>
-        <w:t>FLUJO: genera el SQL con la vista correcta (+ COLUMNAS ESTÁNDAR; barrido = SELECT * de vw_ObservadosResumen/Detalle) → auto-verifica (vista, columnas, DDI) → ejecuta UNA SOLA query con TEST - SQL - V2. Si devuelve filas, entrega el JSON y DETENTE (⛔ NUNCA una 2ª query, ni distinta NI la MISMA repetida). Solo si hubo ERROR/BadGateway, reintenta la MISMA UNA vez. EXCEPCIÓN 0 filas (posible nombre de compartimiento): UNA query de descubrimiento (SELECT DISTINCT Compartimiento … WHERE Equipo='…') + la final; NO explores en cadena.</w:t>
+        <w:t>FLUJO: genera el SQL con la vista correcta (+ COLUMNAS ESTÁNDAR; barrido = SELECT * de vw_ObservadosResumen/Detalle) → auto-verifica (vista, columnas, DDI) → ejecuta UNA SOLA query con TEST - SQL - V2. Si devuelve filas, entrega el JSON y DETENTE (⛔ NUNCA una 2ª query, ni distinta NI la MISMA repetida). Solo si hubo ERROR/BadGateway, reintenta la MISMA UNA vez. EXCEPCIÓN 0 filas: 1 query de descubrimiento (SELECT DISTINCT Compartimiento WHERE Equipo='…') + la final; NO en cadena.</w:t>
       </w:r>
     </w:p>
     <w:sectPr>

</xml_diff>

<commit_message>
fix(continuidad): tendencia de un metal sin componente = TODOS (no arrastrar el componente previo)
Cruce detectado: 'tendencia del sodio en el 3174' (sin componente, equipo nuevo) heredó el
'%TRACCION%LH' de la consulta anterior ('Si en el MT LH'). Fix:
- KomfIA_SQL ENRUTAMIENTO: «tendencia de un metal» = TODOS los componentes; AND Compartimiento
  SOLO si LA CONSULTA ACTUAL nombra uno; ⛔ NO heredes el compartimiento previo.
- KomfIA_central CONTINUIDAD: cambio de equipo o «tendencia de un metal» sin componente →
  NO arrastres el componente/lado previo (=todos).
Compactado (central 7903, sql 7875). Solo instrucciones.

Co-Authored-By: Claude Opus 4.8 <noreply@anthropic.com>
</commit_message>
<xml_diff>
--- a/docs/copilot/KomfIA_SQL.docx
+++ b/docs/copilot/KomfIA_SQL.docx
@@ -246,7 +246,7 @@
           <w:color w:val="1A1A1A"/>
           <w:sz w:val="17"/>
         </w:rPr>
-        <w:t>ENRUTAMIENTO (decide la vista ANTES de escribir el SELECT): «qué EQUIPOS observados / barrido / observados de la flota/proyecto/modelo» (SIN decir MT/motor/tracción) → BARRIDO 2-pasos (PASO 1 vw_ObservadosResumen → PASO 2 vw_ObservadosDetalle; follow-up «detalle…» = PASO 2). ⛔ En barrido NUNCA vw_EstadoActualMT, vw_UltimoAnalisisAceite ni vw_MuestrasEstado. «MOTORES/MT/tracción observados/triage» → vw_EstadoActualMT. Condición de 1 equipo MT → vw_EstadoActualMT. DIAGNÓSTICO / «estado completo» / «todos los componentes» de 1 equipo SIN nombrar componente → vw_DiagnosticoEquipo; si nombran UN componente (ej. «diagnóstico del MT LH») o piden «último análisis» de 1 compartimiento → vw_UltimoAnalisisAceite (ese compartimiento). HISTORIAL muestra por muestra de 1 componente → vw_HistorialMuestra (default 2 meses). «detalle por elemento»/«matriz completa» TRAS una tendencia → vw_TendenciaElemento (COMPARTIMIENTO EXACTO). «tendencia de UN metal» (ej. «tendencia del sodio») → vw_TendenciaElemento WHERE Equipo AND Parametro='Na' [AND Compartimiento LIKE '%…%' SOLO si nombran un componente].</w:t>
+        <w:t>ENRUTAMIENTO (decide la vista ANTES de escribir el SELECT): «qué EQUIPOS observados / barrido / observados de la flota/proyecto/modelo» (SIN decir MT/motor/tracción) → BARRIDO 2-pasos (PASO 1 vw_ObservadosResumen → PASO 2 vw_ObservadosDetalle; follow-up «detalle…» = PASO 2). «MOTORES/MT/tracción observados/triage» → vw_EstadoActualMT. Condición de 1 equipo MT → vw_EstadoActualMT. DIAGNÓSTICO / «estado completo» / «todos los componentes» de 1 equipo SIN nombrar componente → vw_DiagnosticoEquipo; si nombran UN componente (ej. «diagnóstico del MT LH») o piden «último análisis» de 1 compartimiento → vw_UltimoAnalisisAceite (ese compartimiento). HISTORIAL muestra por muestra de 1 componente → vw_HistorialMuestra (default 2 meses). «detalle por elemento»/«matriz completa» TRAS una tendencia → vw_TendenciaElemento (COMPARTIMIENTO EXACTO). «tendencia de UN metal» (ej. «sodio») → vw_TendenciaElemento WHERE Equipo AND Parametro='Na' = TODOS los componentes; agrega AND Compartimiento SOLO si LA CONSULTA ACTUAL nombra un componente (⛔ NO heredes el compartimiento previo).</w:t>
       </w:r>
     </w:p>
     <w:p>
@@ -382,7 +382,7 @@
           <w:color w:val="1A1A1A"/>
           <w:sz w:val="17"/>
         </w:rPr>
-        <w:t>- Detalle por elemento (tras tendencia): SELECT * FROM vw_TendenciaElemento WITH (NOLOCK) WHERE Equipo='CA3198' AND Compartimiento LIKE '%TRACCION%' [AND LIKE '%RH'] AND EsRelevante=1 ORDER BY Orden. «matriz completa/todos los parámetros» → la MISMA SIN 'AND EsRelevante=1'. Tendencia de UN metal: la MISMA con AND Parametro='Na' [AND Compartimiento si nombran un componente].</w:t>
+        <w:t>- Detalle por elemento (tras tendencia): SELECT * FROM vw_TendenciaElemento WITH (NOLOCK) WHERE Equipo='CA3198' AND Compartimiento LIKE '%TRACCION%' [AND LIKE '%RH'] AND EsRelevante=1 ORDER BY Orden. «matriz completa/todos los parámetros» → la MISMA SIN 'AND EsRelevante=1'. Tendencia de UN metal: AND Parametro='Na' (compartimiento SOLO si lo nombran; todos si no).</w:t>
       </w:r>
     </w:p>
     <w:p>
@@ -501,7 +501,7 @@
           <w:color w:val="1A1A1A"/>
           <w:sz w:val="17"/>
         </w:rPr>
-        <w:t>FLUJO: genera el SQL con la vista correcta (+ COLUMNAS ESTÁNDAR; barrido = SELECT * de vw_ObservadosResumen/Detalle) → auto-verifica (vista, columnas, DDI) → ejecuta UNA SOLA query con TEST - SQL - V2. Si devuelve filas, entrega el JSON y DETENTE (⛔ NUNCA una 2ª query, ni distinta NI la MISMA repetida). Solo si hubo ERROR/BadGateway, reintenta la MISMA UNA vez. EXCEPCIÓN 0 filas: 1 query de descubrimiento (SELECT DISTINCT Compartimiento WHERE Equipo='…') + la final; NO en cadena.</w:t>
+        <w:t>FLUJO: genera el SQL con la vista correcta (+ COLUMNAS ESTÁNDAR; barrido = SELECT * de vw_ObservadosResumen/Detalle) → auto-verifica (vista, columnas, DDI) → ejecuta UNA SOLA query con TEST - SQL - V2. Si devuelve filas, entrega el JSON y DETENTE (⛔ NUNCA una 2ª query, ni distinta NI la MISMA repetida). Solo si ERROR/BadGateway, reintenta la MISMA 1 vez. EXCEPCIÓN 0 filas: 1 query SELECT DISTINCT Compartimiento WHERE Equipo='…' + la final; NO en cadena.</w:t>
       </w:r>
     </w:p>
     <w:sectPr>

</xml_diff>

<commit_message>
feat(historial): cablea las 5 variantes (KomfIA_SQL + Formatos)
- KomfIA_SQL: ENRUTAMIENTO historial = 3 alcances (equipo / +componente / flota-observados con
  Mets_Obs IS NOT NULL); plantilla con los 3 filtros; barrido marcado «SIN historial» para no
  cruzar con la variante flota. Compactado (margen 66; sin tocar el resto).
- Formatos: sección historial reescrita a las 5 variantes (general/metal/metal+comp/comp/flota);
  reemplaza el formato ancho de 17 columnas (superado). La columna (Met.Obs o un metal) la elige el central.
- central: sin cambios (linea 11 + excepcion REGLA CERO ya cubren historial → Formatos).

Co-Authored-By: Claude Opus 4.8 <noreply@anthropic.com>
</commit_message>
<xml_diff>
--- a/docs/copilot/KomfIA_SQL.docx
+++ b/docs/copilot/KomfIA_SQL.docx
@@ -246,7 +246,7 @@
           <w:color w:val="1A1A1A"/>
           <w:sz w:val="17"/>
         </w:rPr>
-        <w:t>ENRUTAMIENTO (decide la vista ANTES de escribir el SELECT): «qué EQUIPOS observados / barrido / observados de la flota/proyecto/modelo» (SIN decir MT/motor/tracción) → BARRIDO 2-pasos (PASO 1 vw_ObservadosResumen → PASO 2 vw_ObservadosDetalle; follow-up «detalle…» = PASO 2). «MOTORES/MT/tracción observados/triage» → vw_EstadoActualMT. Condición de 1 equipo MT → vw_EstadoActualMT. DIAGNÓSTICO / «estado completo» / «todos los componentes» de 1 equipo SIN nombrar componente → vw_DiagnosticoEquipo; si nombran UN componente (ej. «diagnóstico del MT LH») o piden «último análisis» de 1 compartimiento → vw_UltimoAnalisisAceite (ese compartimiento). HISTORIAL muestra por muestra de 1 componente → vw_HistorialMuestra (default 2 meses). «detalle por elemento»/«matriz completa» TRAS una tendencia → vw_TendenciaElemento (COMPARTIMIENTO EXACTO). «tendencia de UN metal» (ej. «sodio») → vw_TendenciaElemento WHERE Equipo AND Parametro='Na' = TODOS los componentes; agrega AND Compartimiento SOLO si LA CONSULTA ACTUAL nombra un componente (⛔ NO heredes el compartimiento previo).</w:t>
+        <w:t>ENRUTAMIENTO (decide la vista ANTES de escribir el SELECT): «qué EQUIPOS observados / barrido / observados de la flota/proyecto/modelo» (SIN «historial» ni MT/motor/tracción) → BARRIDO 2-pasos (PASO 1 vw_ObservadosResumen → PASO 2 vw_ObservadosDetalle; follow-up «detalle…» = PASO 2). «MOTORES/MT/tracción observados/triage» → vw_EstadoActualMT. Condición de 1 equipo MT → vw_EstadoActualMT. DIAGNÓSTICO/«estado completo» de 1 equipo SIN componente → vw_DiagnosticoEquipo; CON componente nombrado (ej. «diagnóstico del MT LH») o «último análisis» de 1 compartimiento → vw_UltimoAnalisisAceite. HISTORIAL (cronológico) → vw_HistorialMuestra (2 meses, SELECT *); alcance equipo / +componente / flota-observados (ver plantilla Historial; la columna la elige el central). «detalle por elemento»/«matriz completa» TRAS una tendencia → vw_TendenciaElemento (COMPARTIMIENTO EXACTO). «tendencia de UN metal» (ej. «sodio») → vw_TendenciaElemento WHERE Equipo AND Parametro='Na' = TODOS los componentes; agrega AND Compartimiento SOLO si LA CONSULTA ACTUAL nombra un componente (⛔ NO heredes el compartimiento previo).</w:t>
       </w:r>
     </w:p>
     <w:p>
@@ -348,7 +348,7 @@
           <w:color w:val="1A1A1A"/>
           <w:sz w:val="17"/>
         </w:rPr>
-        <w:t>- Historial muestra por muestra (incluye DDI): SELECT * FROM vw_HistorialMuestra WHERE Equipo='CA3198' AND Compartimiento LIKE '%TRACCION%LH' ORDER BY FechaMuestreo DESC. (la vista YA acota 2 meses).</w:t>
+        <w:t>- Historial (incluye DDI; vista acota 2 meses): SELECT * FROM vw_HistorialMuestra WHERE Equipo='CA3198' [AND Compartimiento LIKE '%TRACCION%LH'] ORDER BY FechaMuestreo DESC. Flota observados: WHERE Proyecto LIKE '%…%' [AND Modelo] AND Mets_Obs IS NOT NULL ORDER BY FechaMuestreo DESC, Equipo.</w:t>
       </w:r>
     </w:p>
     <w:p>
@@ -484,7 +484,7 @@
           <w:color w:val="1A1A1A"/>
           <w:sz w:val="17"/>
         </w:rPr>
-        <w:t>REGLAS: Solo SELECT/CTE. WITH (NOLOCK). ⛔ USA SOLO vistas vw_* listadas; NUNCA inventes vista/columna (no hay _LP de B/P/V100). TOP N (nunca LIMIT); sin límite TOP 100, en TRIAGE TOP 500. NUNCA SELECT * (salvo vw_ObservadosResumen, vw_ObservadosDetalle, vw_TendenciaElemento, vw_HistorialMuestra, vw_DiagnosticoEquipo) ni Estado_&lt;metal&gt;. Pb/Sn/TBN sin _LC. NUNCA [FIERRO - LP]/[CROMO - LP] contra una vista (eso es de [Eqpcare].[lc]). Horas de aceite = HorasDeAceite. Equipo = ME.[Code]/columna Equipo (NUNCA EquipmentCode/EquipmentId). Lado izquierdo=LH, derecho=RH → Compartimiento LIKE '%LH'/'%RH'. Compartimiento keyword (detalle en Esquema): MT/tracción→'%TRACCION%' (⛔ NUNCA '%MANDO%'/'%TRASLADO%'), motor→'%MOTOR%', hidráulico→'%HIDRAUL%', rueda→'%RUEDA%', mando→'%MANDO%', transmisión→'%TRANSMISION%'. Antapaccay → 980E (sin proyecto, no fuerces 980E). NUNCA uses Condicion (1/2/3). Tabla base solo si ninguna vista cubre (ROW_NUMBER ORDER BY FechaMuestreo DESC, LaboratoryDataId DESC).</w:t>
+        <w:t>REGLAS: Solo SELECT/CTE. WITH (NOLOCK). ⛔ USA SOLO vistas vw_* listadas; NUNCA inventes vista/columna (no hay _LP de B/P/V100). TOP N (nunca LIMIT); sin límite TOP 100, en TRIAGE TOP 500. NUNCA SELECT * (salvo vw_ObservadosResumen, vw_ObservadosDetalle, vw_TendenciaElemento, vw_HistorialMuestra, vw_DiagnosticoEquipo) ni Estado_&lt;metal&gt;. Pb/Sn/TBN sin _LC. NUNCA [FIERRO - LP]/[CROMO - LP] contra una vista (eso es de [Eqpcare].[lc]). Horas de aceite = HorasDeAceite. Equipo = ME.[Code]/columna Equipo (NUNCA EquipmentCode/EquipmentId). Lado izquierdo=LH, derecho=RH → Compartimiento LIKE '%LH'/'%RH'. Compartimiento keyword (ver Esquema): tracción→'%TRACCION%' (⛔ NO '%MANDO%'/'%TRASLADO%'); motor/hidráulico/rueda/mando/transmisión → %MOTOR%/%HIDRAUL%/%RUEDA%/%MANDO%/%TRANSMISION%. Antapaccay → 980E (sin proyecto, no fuerces 980E). NUNCA uses Condicion (1/2/3). Tabla base [Oil].[LaboratoryData] solo si ninguna vista cubre.</w:t>
       </w:r>
     </w:p>
     <w:p>

</xml_diff>

<commit_message>
fix(historial): columnas de la variante en vez de SELECT * (anti-corte)
El historial se cortaba: SELECT * de vw_HistorialMuestra trae ~25 columnas (17 params + meta +
Mets_Obs + Hor.Comp) x ~12 muestras -> payload pesado -> el central no renderizaba. Las variantes
solo necesitan Met.Obs o UN metal. Fix: plantilla historial pide SOLO columnas de la variante
(FechaMuestreo, Horometro, HorasDeAceite, HorasComponente, CM, Estado_General, Compartimiento +
[Mets_Obs o un metal]); quitado vw_HistorialMuestra de la excepcion SELECT *. Compactado (margen 65).

Co-Authored-By: Claude Opus 4.8 <noreply@anthropic.com>
</commit_message>
<xml_diff>
--- a/docs/copilot/KomfIA_SQL.docx
+++ b/docs/copilot/KomfIA_SQL.docx
@@ -167,7 +167,7 @@
           <w:rFonts w:ascii="Courier New" w:hAnsi="Courier New"/>
           <w:sz w:val="17"/>
         </w:rPr>
-        <w:t>- vw_HistorialMuestra → HISTORIAL muestra por muestra (incluye DDI), PRE-FORMATEADO (chips). YA filtra 2 meses (en la vista). SELECT * (ligera).</w:t>
+        <w:t>- vw_HistorialMuestra → HISTORIAL (incluye DDI, 2 meses, con Mets_Obs). ⛔ NO SELECT * (17 params); solo columnas de la variante.</w:t>
       </w:r>
     </w:p>
     <w:p>
@@ -246,7 +246,7 @@
           <w:color w:val="1A1A1A"/>
           <w:sz w:val="17"/>
         </w:rPr>
-        <w:t>ENRUTAMIENTO (decide la vista ANTES de escribir el SELECT): «qué EQUIPOS observados / barrido / observados de la flota/proyecto/modelo» (SIN «historial» ni MT/motor/tracción) → BARRIDO 2-pasos (PASO 1 vw_ObservadosResumen → PASO 2 vw_ObservadosDetalle; follow-up «detalle…» = PASO 2). «MOTORES/MT/tracción observados/triage» → vw_EstadoActualMT. Condición de 1 equipo MT → vw_EstadoActualMT. DIAGNÓSTICO/«estado completo» de 1 equipo SIN componente → vw_DiagnosticoEquipo; CON componente nombrado (ej. «diagnóstico del MT LH») o «último análisis» de 1 compartimiento → vw_UltimoAnalisisAceite. HISTORIAL (cronológico) → vw_HistorialMuestra (2 meses, SELECT *); alcance equipo / +componente / flota-observados (ver plantilla Historial; la columna la elige el central). «detalle por elemento»/«matriz completa» TRAS una tendencia → vw_TendenciaElemento (COMPARTIMIENTO EXACTO). «tendencia de UN metal» (ej. «sodio») → vw_TendenciaElemento WHERE Equipo AND Parametro='Na' = TODOS los componentes; agrega AND Compartimiento SOLO si LA CONSULTA ACTUAL nombra un componente (⛔ NO heredes el compartimiento previo).</w:t>
+        <w:t>ENRUTAMIENTO (decide la vista ANTES de escribir el SELECT): «qué EQUIPOS observados / barrido / observados de la flota/proyecto/modelo» (SIN «historial» ni MT/motor/tracción) → BARRIDO 2-pasos (PASO 1 vw_ObservadosResumen → PASO 2 vw_ObservadosDetalle; follow-up «detalle…» = PASO 2). «MOTORES/MT/tracción observados/triage» → vw_EstadoActualMT. Condición de 1 equipo MT → vw_EstadoActualMT. DIAGNÓSTICO/«estado completo» de 1 equipo SIN componente → vw_DiagnosticoEquipo; CON componente nombrado (ej. «diagnóstico del MT LH») o «último análisis» de 1 compartimiento → vw_UltimoAnalisisAceite. HISTORIAL (cronológico) → vw_HistorialMuestra (2 meses); alcance equipo / +componente / flota-observados (ver plantilla; columnas de la variante, NO SELECT *). «detalle por elemento»/«matriz completa» TRAS una tendencia → vw_TendenciaElemento (COMPARTIMIENTO EXACTO). «tendencia de UN metal» (ej. «sodio») → vw_TendenciaElemento WHERE Equipo AND Parametro='Na' = TODOS los componentes; agrega AND Compartimiento SOLO si LA CONSULTA ACTUAL nombra un componente (⛔ NO heredes el compartimiento previo).</w:t>
       </w:r>
     </w:p>
     <w:p>
@@ -348,7 +348,7 @@
           <w:color w:val="1A1A1A"/>
           <w:sz w:val="17"/>
         </w:rPr>
-        <w:t>- Historial (incluye DDI; vista acota 2 meses): SELECT * FROM vw_HistorialMuestra WHERE Equipo='CA3198' [AND Compartimiento LIKE '%TRACCION%LH'] ORDER BY FechaMuestreo DESC. Flota observados: WHERE Proyecto LIKE '%…%' [AND Modelo] AND Mets_Obs IS NOT NULL ORDER BY FechaMuestreo DESC, Equipo.</w:t>
+        <w:t>- Historial (incluye DDI; 2m; ⛔ NO SELECT *—se corta): SELECT FechaMuestreo, Horometro, HorasDeAceite, HorasComponente, CM, Estado_General, Compartimiento, [Mets_Obs O un metal ej. Fe] FROM vw_HistorialMuestra WHERE Equipo='CA3171' [AND Compartimiento LIKE '%..%'] ORDER BY FechaMuestreo DESC. Flota: agrega Equipo, AND Mets_Obs IS NOT NULL.</w:t>
       </w:r>
     </w:p>
     <w:p>
@@ -484,7 +484,7 @@
           <w:color w:val="1A1A1A"/>
           <w:sz w:val="17"/>
         </w:rPr>
-        <w:t>REGLAS: Solo SELECT/CTE. WITH (NOLOCK). ⛔ USA SOLO vistas vw_* listadas; NUNCA inventes vista/columna (no hay _LP de B/P/V100). TOP N (nunca LIMIT); sin límite TOP 100, en TRIAGE TOP 500. NUNCA SELECT * (salvo vw_ObservadosResumen, vw_ObservadosDetalle, vw_TendenciaElemento, vw_HistorialMuestra, vw_DiagnosticoEquipo) ni Estado_&lt;metal&gt;. Pb/Sn/TBN sin _LC. NUNCA [FIERRO - LP]/[CROMO - LP] contra una vista (eso es de [Eqpcare].[lc]). Horas de aceite = HorasDeAceite. Equipo = ME.[Code]/columna Equipo (NUNCA EquipmentCode/EquipmentId). Lado izquierdo=LH, derecho=RH → Compartimiento LIKE '%LH'/'%RH'. Compartimiento keyword (ver Esquema): tracción→'%TRACCION%' (⛔ NO '%MANDO%'/'%TRASLADO%'); motor/hidráulico/rueda/mando/transmisión → %MOTOR%/%HIDRAUL%/%RUEDA%/%MANDO%/%TRANSMISION%. Antapaccay → 980E (sin proyecto, no fuerces 980E). NUNCA uses Condicion (1/2/3). Tabla base [Oil].[LaboratoryData] solo si ninguna vista cubre.</w:t>
+        <w:t>REGLAS: Solo SELECT/CTE. WITH (NOLOCK). ⛔ USA SOLO vistas vw_* listadas; NUNCA inventes vista/columna (no hay _LP de B/P/V100). TOP N (nunca LIMIT); sin límite TOP 100, en TRIAGE TOP 500. NUNCA SELECT * (salvo vw_ObservadosResumen, vw_ObservadosDetalle, vw_TendenciaElemento, vw_DiagnosticoEquipo) ni Estado_&lt;metal&gt;. Pb/Sn/TBN sin _LC. NUNCA [FIERRO - LP]/[CROMO - LP] contra una vista (eso es de [Eqpcare].[lc]). Horas de aceite = HorasDeAceite. Equipo = ME.[Code]/columna Equipo (NUNCA EquipmentCode/EquipmentId). Lado izquierdo=LH, derecho=RH → Compartimiento LIKE '%LH'/'%RH'. Compartimiento keyword (ver Esquema): tracción→'%TRACCION%' (⛔ NO '%MANDO%'/'%TRASLADO%'); motor/hidráulico/rueda/mando/transmisión → %MOTOR%/%HIDRAUL%/%RUEDA%/%MANDO%/%TRANSMISION%. Antapaccay → 980E (sin proyecto, no fuerces 980E). NUNCA uses Condicion (1/2/3). Tabla base [Oil].[LaboratoryData] solo si ninguna vista cubre.</w:t>
       </w:r>
     </w:p>
     <w:p>
@@ -501,7 +501,7 @@
           <w:color w:val="1A1A1A"/>
           <w:sz w:val="17"/>
         </w:rPr>
-        <w:t>FLUJO: genera el SQL con la vista correcta (+ COLUMNAS ESTÁNDAR; barrido = SELECT * de vw_ObservadosResumen/Detalle) → auto-verifica (vista, columnas, DDI) → ejecuta UNA SOLA query con TEST - SQL - V2. Si devuelve filas, entrega el JSON y DETENTE (⛔ NUNCA una 2ª query, ni distinta NI la MISMA repetida). Solo si ERROR/BadGateway, reintenta la MISMA 1 vez. EXCEPCIÓN 0 filas: 1 query SELECT DISTINCT Compartimiento WHERE Equipo='…' + la final; NO en cadena.</w:t>
+        <w:t>FLUJO: genera el SQL con la vista correcta (+ COLUMNAS ESTÁNDAR; barrido = SELECT * de vw_ObservadosResumen/Detalle) → auto-verifica (vista, columnas, DDI) → ejecuta UNA SOLA query con TEST - SQL - V2. Si devuelve filas, entrega el JSON y DETENTE (⛔ NUNCA una 2ª query, ni distinta NI la MISMA repetida). Solo si ERROR/BadGateway, reintenta la MISMA 1 vez. EXCEPCIÓN 0 filas: 1 query de descubrimiento (SELECT DISTINCT Compartimiento) + la final; NO en cadena.</w:t>
       </w:r>
     </w:p>
     <w:sectPr>

</xml_diff>

<commit_message>
fix(historial): metal = columna-simbolo (Fe), no Fe_ppm/Fe_LP/Fe_LC
2a prueba ('historial del Fe en el MT LH') fallo: 'Invalid column name Fe_ppm/Fe_LP/Fe_LC' (404,
enmascarado como BadGateway -> reintentos en cascada). vw_HistorialMuestra renombra los metales a
columna SIMBOLO (Fe, con chip embebido); no tiene Fe_ppm/_LP/_LC (eso es la fundacion). Fix:
- KomfIA_SQL plantilla historial: un metal = la columna-SIMBOLO (Fe/Cr/Cu, NO Fe_ppm/_LP/_LC).
- Esquema: nota que las vistas pre-formateadas (Historial/Diagnostico/Tendencia) usan columnas simbolo.
La 1a variante (historial del MT LH) ya salia OK. Compactado.

Co-Authored-By: Claude Opus 4.8 <noreply@anthropic.com>
</commit_message>
<xml_diff>
--- a/docs/copilot/KomfIA_SQL.docx
+++ b/docs/copilot/KomfIA_SQL.docx
@@ -348,7 +348,7 @@
           <w:color w:val="1A1A1A"/>
           <w:sz w:val="17"/>
         </w:rPr>
-        <w:t>- Historial (incluye DDI; 2m; ⛔ NO SELECT *—se corta): SELECT FechaMuestreo, Horometro, HorasDeAceite, HorasComponente, CM, Estado_General, Compartimiento, [Mets_Obs O un metal ej. Fe] FROM vw_HistorialMuestra WHERE Equipo='CA3171' [AND Compartimiento LIKE '%..%'] ORDER BY FechaMuestreo DESC. Flota: agrega Equipo, AND Mets_Obs IS NOT NULL.</w:t>
+        <w:t>- Historial (incluye DDI; 2m; ⛔ NO SELECT *—se corta): SELECT FechaMuestreo, Horometro, HorasDeAceite, HorasComponente, CM, Estado_General, Compartimiento, [Mets_Obs O la columna-SÍMBOLO del metal: Fe/Cr/Cu… ⛔ NO Fe_ppm/Fe_LP/Fe_LC] FROM vw_HistorialMuestra WHERE Equipo='CA3171' [AND Compartimiento LIKE '%..%'] ORDER BY FechaMuestreo DESC. Flota: agrega Equipo, AND Mets_Obs IS NOT NULL.</w:t>
       </w:r>
     </w:p>
     <w:p>
@@ -382,7 +382,7 @@
           <w:color w:val="1A1A1A"/>
           <w:sz w:val="17"/>
         </w:rPr>
-        <w:t>- Detalle por elemento (tras tendencia): SELECT * FROM vw_TendenciaElemento WITH (NOLOCK) WHERE Equipo='CA3198' AND Compartimiento LIKE '%TRACCION%' [AND LIKE '%RH'] AND EsRelevante=1 ORDER BY Orden. «matriz completa/todos los parámetros» → la MISMA SIN 'AND EsRelevante=1'. Tendencia de UN metal: AND Parametro='Na' (compartimiento SOLO si lo nombran; todos si no).</w:t>
+        <w:t>- Detalle por elemento (tras tendencia): SELECT * FROM vw_TendenciaElemento WITH (NOLOCK) WHERE Equipo='CA3198' AND Compartimiento LIKE '%TRACCION%' [AND LIKE '%RH'] AND EsRelevante=1 ORDER BY Orden. «matriz completa/todos los parámetros» → la MISMA SIN 'AND EsRelevante=1'.</w:t>
       </w:r>
     </w:p>
     <w:p>
@@ -501,7 +501,7 @@
           <w:color w:val="1A1A1A"/>
           <w:sz w:val="17"/>
         </w:rPr>
-        <w:t>FLUJO: genera el SQL con la vista correcta (+ COLUMNAS ESTÁNDAR; barrido = SELECT * de vw_ObservadosResumen/Detalle) → auto-verifica (vista, columnas, DDI) → ejecuta UNA SOLA query con TEST - SQL - V2. Si devuelve filas, entrega el JSON y DETENTE (⛔ NUNCA una 2ª query, ni distinta NI la MISMA repetida). Solo si ERROR/BadGateway, reintenta la MISMA 1 vez. EXCEPCIÓN 0 filas: 1 query de descubrimiento (SELECT DISTINCT Compartimiento) + la final; NO en cadena.</w:t>
+        <w:t>FLUJO: genera el SQL con la vista correcta (+ COLUMNAS ESTÁNDAR; barrido = SELECT * de vw_ObservadosResumen/Detalle) → auto-verifica (vista, columnas, DDI) → ejecuta UNA SOLA query con TEST - SQL - V2. Si devuelve filas, entrega el JSON y DETENTE (⛔ NUNCA una 2ª query, ni distinta NI la MISMA repetida). Solo si ERROR/BadGateway, reintenta la MISMA 1 vez. EXCEPCIÓN 0 filas: 1 query SELECT DISTINCT Compartimiento + la final; NO en cadena.</w:t>
       </w:r>
     </w:p>
     <w:sectPr>

</xml_diff>

<commit_message>
feat(historial-flota): vista vw_HistorialFlotaObs agregada (anti-timeout)
Variante 5 (observados de flota) se colgaba: vw_HistorialMuestra fleet-wide x 2 meses + Mets_Obs ->
50-81s -> BadGateway/timeout -> reintentos + ~100 filas crudas. Solucion directa:
- DDL vista #13 vw_HistorialFlotaObs: AGREGA por (Proyecto,Modelo,Fecha) -> 1 fila/dia (NumEquipos,
  Equip_Obs, Comp_Obs, Met_Obs via STRING_AGG/STRING_SPLIT), ventana 30 dias, sin params ni Hor.Comp.
  Liviana y rapida; el central PINTA directo (no agrega).
- KomfIA_SQL: plantilla/ENRUTAMIENTO flota -> SELECT * FROM vw_HistorialFlotaObs; + a la excepcion SELECT *.
- Formatos var.5 + Esquema: actualizados a la vista agregada. Compactado SQL (margen 69).
- VALIDACION Bloque 20 (latencia). Re-correr DDL (vista nueva).

Co-Authored-By: Claude Opus 4.8 <noreply@anthropic.com>
</commit_message>
<xml_diff>
--- a/docs/copilot/KomfIA_SQL.docx
+++ b/docs/copilot/KomfIA_SQL.docx
@@ -246,7 +246,7 @@
           <w:color w:val="1A1A1A"/>
           <w:sz w:val="17"/>
         </w:rPr>
-        <w:t>ENRUTAMIENTO (decide la vista ANTES de escribir el SELECT): «qué EQUIPOS observados / barrido / observados de la flota/proyecto/modelo» (SIN «historial» ni MT/motor/tracción) → BARRIDO 2-pasos (PASO 1 vw_ObservadosResumen → PASO 2 vw_ObservadosDetalle; follow-up «detalle…» = PASO 2). «MOTORES/MT/tracción observados/triage» → vw_EstadoActualMT. Condición de 1 equipo MT → vw_EstadoActualMT. DIAGNÓSTICO/«estado completo» de 1 equipo SIN componente → vw_DiagnosticoEquipo; CON componente nombrado (ej. «diagnóstico del MT LH») o «último análisis» de 1 compartimiento → vw_UltimoAnalisisAceite. HISTORIAL (cronológico) → vw_HistorialMuestra (2 meses); alcance equipo / +componente / flota-observados (ver plantilla; columnas de la variante, NO SELECT *). «detalle por elemento»/«matriz completa» TRAS una tendencia → vw_TendenciaElemento (COMPARTIMIENTO EXACTO). «tendencia de UN metal» (ej. «sodio») → vw_TendenciaElemento WHERE Equipo AND Parametro='Na' = TODOS los componentes; agrega AND Compartimiento SOLO si LA CONSULTA ACTUAL nombra un componente (⛔ NO heredes el compartimiento previo).</w:t>
+        <w:t>ENRUTAMIENTO (decide la vista ANTES de escribir el SELECT): «qué EQUIPOS observados / barrido / observados de la flota/proyecto/modelo» (SIN «historial» ni MT/motor/tracción) → BARRIDO 2-pasos (vw_ObservadosResumen→vw_ObservadosDetalle; follow-up «detalle…»=PASO 2; ver plantilla). «MOTORES/MT/tracción observados/triage» → vw_EstadoActualMT. Condición de 1 equipo MT → vw_EstadoActualMT. DIAGNÓSTICO/«estado completo» de 1 equipo SIN componente → vw_DiagnosticoEquipo; CON componente nombrado (ej. «diagnóstico del MT LH») o «último análisis» de 1 compartimiento → vw_UltimoAnalisisAceite. HISTORIAL (cronológico): equipo / +componente → vw_HistorialMuestra (columnas de la variante, NO SELECT *); flota-observados → vw_HistorialFlotaObs (agregada por fecha, SELECT *). Ver plantilla. «detalle por elemento» tras tendencia → vw_TendenciaElemento (compartimiento exacto). «tendencia de UN metal» (ej. «sodio») → vw_TendenciaElemento WHERE Equipo AND Parametro='Na' = TODOS los componentes; agrega AND Compartimiento SOLO si LA CONSULTA ACTUAL nombra un componente (⛔ NO heredes el compartimiento previo).</w:t>
       </w:r>
     </w:p>
     <w:p>
@@ -348,7 +348,7 @@
           <w:color w:val="1A1A1A"/>
           <w:sz w:val="17"/>
         </w:rPr>
-        <w:t>- Historial (incluye DDI; 2m; ⛔ NO SELECT *—se corta): SELECT FechaMuestreo, Horometro, HorasDeAceite, HorasComponente, CM, Estado_General, Compartimiento, [Mets_Obs O la columna-SÍMBOLO del metal: Fe/Cr/Cu… ⛔ NO Fe_ppm/Fe_LP/Fe_LC] FROM vw_HistorialMuestra WHERE Equipo='CA3171' [AND Compartimiento LIKE '%..%'] ORDER BY FechaMuestreo DESC. Flota: agrega Equipo, AND Mets_Obs IS NOT NULL.</w:t>
+        <w:t>- Historial (incluye DDI; 2m; ⛔ NO SELECT *—se corta): SELECT FechaMuestreo, Horometro, HorasDeAceite, HorasComponente, CM, Estado_General, Compartimiento, [Mets_Obs O la columna-SÍMBOLO del metal: Fe/Cr/Cu… ⛔ NO Fe_ppm/Fe_LP/Fe_LC] FROM vw_HistorialMuestra WHERE Equipo='CA3171' [AND Compartimiento LIKE '%..%'] ORDER BY FechaMuestreo DESC. Flota observados: SELECT * FROM vw_HistorialFlotaObs WHERE Proyecto LIKE '%..%' [AND Modelo] ORDER BY FechaMuestreo DESC (agregada/fecha, 30d; ⛔ NO vw_HistorialMuestra fleet-wide).</w:t>
       </w:r>
     </w:p>
     <w:p>
@@ -382,7 +382,7 @@
           <w:color w:val="1A1A1A"/>
           <w:sz w:val="17"/>
         </w:rPr>
-        <w:t>- Detalle por elemento (tras tendencia): SELECT * FROM vw_TendenciaElemento WITH (NOLOCK) WHERE Equipo='CA3198' AND Compartimiento LIKE '%TRACCION%' [AND LIKE '%RH'] AND EsRelevante=1 ORDER BY Orden. «matriz completa/todos los parámetros» → la MISMA SIN 'AND EsRelevante=1'.</w:t>
+        <w:t>- Detalle por elemento (tras tendencia): SELECT * FROM vw_TendenciaElemento WHERE Equipo='CA3198' AND Compartimiento LIKE '%TRACCION%' [AND LIKE '%RH'] AND EsRelevante=1 ORDER BY Orden. «matriz completa» → SIN 'AND EsRelevante=1'.</w:t>
       </w:r>
     </w:p>
     <w:p>
@@ -399,7 +399,7 @@
           <w:color w:val="1A1A1A"/>
           <w:sz w:val="17"/>
         </w:rPr>
-        <w:t>- Conteo de flota: SELECT COUNT(ME.[Id]) AS Total, MP.[Name] AS Proyecto, EF.[Model] AS Modelo FROM [Mine].[MiningEquipment] ME JOIN [Mine].[EquipmentFleet] EF ON EF.[Id]=ME.[EquipmentFleetId] JOIN [Mine].[MiningProject] MP ON MP.[Id]=ME.[MiningProjectId] WHERE MP.[Name] LIKE '%…%' [AND EF.[Model] LIKE '%980%'] GROUP BY MP.[Name], EF.[Model].</w:t>
+        <w:t>- Conteo de flota: SELECT COUNT(ME.[Id]) AS Total, MP.[Name] AS Proyecto, EF.[Model] AS Modelo FROM [Mine].[MiningEquipment] ME JOIN [Mine].[EquipmentFleet] EF ON EF.[Id]=ME.[EquipmentFleetId] JOIN [Mine].[MiningProject] MP ON MP.[Id]=ME.[MiningProjectId] WHERE MP.[Name] LIKE '%…%' [AND EF.[Model] LIKE '%980%'] GROUP BY MP.[Name], EF.[Model]</w:t>
       </w:r>
     </w:p>
     <w:p>
@@ -484,7 +484,7 @@
           <w:color w:val="1A1A1A"/>
           <w:sz w:val="17"/>
         </w:rPr>
-        <w:t>REGLAS: Solo SELECT/CTE. WITH (NOLOCK). ⛔ USA SOLO vistas vw_* listadas; NUNCA inventes vista/columna (no hay _LP de B/P/V100). TOP N (nunca LIMIT); sin límite TOP 100, en TRIAGE TOP 500. NUNCA SELECT * (salvo vw_ObservadosResumen, vw_ObservadosDetalle, vw_TendenciaElemento, vw_DiagnosticoEquipo) ni Estado_&lt;metal&gt;. Pb/Sn/TBN sin _LC. NUNCA [FIERRO - LP]/[CROMO - LP] contra una vista (eso es de [Eqpcare].[lc]). Horas de aceite = HorasDeAceite. Equipo = ME.[Code]/columna Equipo (NUNCA EquipmentCode/EquipmentId). Lado izquierdo=LH, derecho=RH → Compartimiento LIKE '%LH'/'%RH'. Compartimiento keyword (ver Esquema): tracción→'%TRACCION%' (⛔ NO '%MANDO%'/'%TRASLADO%'); motor/hidráulico/rueda/mando/transmisión → %MOTOR%/%HIDRAUL%/%RUEDA%/%MANDO%/%TRANSMISION%. Antapaccay → 980E (sin proyecto, no fuerces 980E). NUNCA uses Condicion (1/2/3). Tabla base [Oil].[LaboratoryData] solo si ninguna vista cubre.</w:t>
+        <w:t>REGLAS: Solo SELECT/CTE. WITH (NOLOCK). ⛔ USA SOLO vistas vw_* listadas; NUNCA inventes vista/columna (no hay _LP de B/P/V100). TOP N (nunca LIMIT); sin límite TOP 100, en TRIAGE TOP 500. NUNCA SELECT * (salvo vw_ObservadosResumen, vw_ObservadosDetalle, vw_TendenciaElemento, vw_DiagnosticoEquipo, vw_HistorialFlotaObs) ni Estado_&lt;metal&gt;. Pb/Sn/TBN sin _LC. NUNCA [FIERRO - LP] contra una vista (eso es de [Eqpcare].[lc]). Equipo = ME.[Code]/columna Equipo (NUNCA EquipmentCode/EquipmentId). Lado izquierdo=LH, derecho=RH → Compartimiento LIKE '%LH'/'%RH'. Compartimiento keyword (ver Esquema): tracción→'%TRACCION%' (⛔ NO '%MANDO%'/'%TRASLADO%'); motor/hidráulico/rueda/mando/transmisión → %MOTOR%/%HIDRAUL%/%RUEDA%/%MANDO%/%TRANSMISION%. Antapaccay → 980E (sin proyecto, no fuerces 980E). NUNCA uses Condicion (1/2/3). Tabla base [Oil].[LaboratoryData] solo si ninguna vista cubre.</w:t>
       </w:r>
     </w:p>
     <w:p>
@@ -501,7 +501,7 @@
           <w:color w:val="1A1A1A"/>
           <w:sz w:val="17"/>
         </w:rPr>
-        <w:t>FLUJO: genera el SQL con la vista correcta (+ COLUMNAS ESTÁNDAR; barrido = SELECT * de vw_ObservadosResumen/Detalle) → auto-verifica (vista, columnas, DDI) → ejecuta UNA SOLA query con TEST - SQL - V2. Si devuelve filas, entrega el JSON y DETENTE (⛔ NUNCA una 2ª query, ni distinta NI la MISMA repetida). Solo si ERROR/BadGateway, reintenta la MISMA 1 vez. EXCEPCIÓN 0 filas: 1 query SELECT DISTINCT Compartimiento + la final; NO en cadena.</w:t>
+        <w:t>FLUJO: genera el SQL con la vista correcta (+ COLUMNAS ESTÁNDAR; barrido = SELECT * de vw_ObservadosResumen/Detalle) → auto-verifica (vista, columnas, DDI) → ejecuta UNA SOLA query con TEST - SQL - V2. Si devuelve filas, entrega el JSON y DETENTE (⛔ NUNCA una 2ª query, ni distinta NI la MISMA repetida). Solo si ERROR/BadGateway, reintenta la MISMA 1 vez. EXCEPCIÓN 0 filas: 1 query SELECT DISTINCT Compartimiento + la final.</w:t>
       </w:r>
     </w:p>
     <w:sectPr>

</xml_diff>

<commit_message>
fix(enrutamiento): «historial» SIEMPRE gana — no cruzar historial-flota con barrido
«historial de observados de la flota» se enrutaba a BARRIDO (vw_ObservadosResumen)
porque el gatillo «observados de la flota» pesaba más que «historial».

- KomfIA_SQL: regla de PRIORIDAD al inicio del ENRUTAMIENTO — si dice
  «historial»/«en el tiempo»/«evolución» = HISTORIAL cronológico, NUNCA
  barrido/triage/diagnóstico-actual (aunque diga «observados»/«flota»).
- KomfIA_central: gatillo barrido aclara «estado ACTUAL ≠ HISTORIAL».
- Compactaciones varias para respetar el techo de 8000 ch (SQL 7999, central 7982).

Co-Authored-By: Claude Opus 4.8 <noreply@anthropic.com>
</commit_message>
<xml_diff>
--- a/docs/copilot/KomfIA_SQL.docx
+++ b/docs/copilot/KomfIA_SQL.docx
@@ -50,7 +50,7 @@
           <w:color w:val="1A1A1A"/>
           <w:sz w:val="17"/>
         </w:rPr>
-        <w:t>USA LAS VISTAS (resuelven último análisis determinístico, LP/LC por proyecto+modelo y Estado; excluyen DDI; sin ROW_NUMBER):</w:t>
+        <w:t>USA LAS VISTAS (resuelven último análisis, LP/LC por proyecto+modelo, Estado; excluyen DDI; sin ROW_NUMBER):</w:t>
       </w:r>
     </w:p>
     <w:p>
@@ -246,7 +246,7 @@
           <w:color w:val="1A1A1A"/>
           <w:sz w:val="17"/>
         </w:rPr>
-        <w:t>ENRUTAMIENTO (decide la vista ANTES de escribir el SELECT): «qué EQUIPOS observados / barrido / observados de la flota/proyecto/modelo» (SIN «historial» ni MT/motor/tracción) → BARRIDO 2-pasos (vw_ObservadosResumen→vw_ObservadosDetalle; follow-up «detalle…»=PASO 2; ver plantilla). «MOTORES/MT/tracción observados/triage» → vw_EstadoActualMT. Condición de 1 equipo MT → vw_EstadoActualMT. DIAGNÓSTICO/«estado completo» de 1 equipo SIN componente → vw_DiagnosticoEquipo; CON componente nombrado (ej. «diagnóstico del MT LH») o «último análisis» de 1 compartimiento → vw_UltimoAnalisisAceite. HISTORIAL (cronológico): equipo / +componente → vw_HistorialMuestra (columnas de la variante, NO SELECT *); flota-observados → vw_HistorialFlotaObs (agregada por fecha, SELECT *). Ver plantilla. «detalle por elemento» tras tendencia → vw_TendenciaElemento (compartimiento exacto). «tendencia de UN metal» (ej. «sodio») → vw_TendenciaElemento WHERE Equipo AND Parametro='Na' = TODOS los componentes; agrega AND Compartimiento SOLO si LA CONSULTA ACTUAL nombra un componente (⛔ NO heredes el compartimiento previo).</w:t>
+        <w:t>ENRUTAMIENTO (decide la vista ANTES del SELECT): ⚠ PRIORIDAD: si la consulta dice «historial»/«en el tiempo»/«evolución» = HISTORIAL cronológico, ⛔ NUNCA barrido/triage/diagnóstico-actual (aunque diga «observados»/«flota»). «qué EQUIPOS observados AHORA / barrido / observados de la flota» (estado ACTUAL, SIN «historial») → BARRIDO 2-pasos (vw_ObservadosResumen→vw_ObservadosDetalle; follow-up «detalle…»=PASO 2; ver plantilla). «MOTORES/MT/tracción observados/triage» → vw_EstadoActualMT. Condición de 1 equipo MT → vw_EstadoActualMT. DIAGNÓSTICO/«estado completo» de 1 equipo SIN componente → vw_DiagnosticoEquipo; CON componente nombrado (ej. «diagnóstico del MT LH») o «último análisis» de 1 compartimiento → vw_UltimoAnalisisAceite. HISTORIAL (cronológico): equipo / +componente → vw_HistorialMuestra (columnas de la variante, NO SELECT *); flota-observados → vw_HistorialFlotaObs (agregada por fecha, SELECT *). Ver plantilla. «detalle por elemento» tras tendencia → vw_TendenciaElemento (compartimiento exacto). «tendencia de UN metal» (ej. «sodio») → vw_TendenciaElemento WHERE Equipo AND Parametro='Na' = TODOS los componentes; agrega AND Compartimiento SOLO si LA CONSULTA ACTUAL nombra un componente (⛔ NO heredes el compartimiento previo).</w:t>
       </w:r>
     </w:p>
     <w:p>
@@ -331,7 +331,7 @@
           <w:color w:val="1A1A1A"/>
           <w:sz w:val="17"/>
         </w:rPr>
-        <w:t>- Tendencia (PASO 1): vw_MuestrasRankeadas WHERE Equipo='CA3198' AND Compartimiento LIKE '%TRACCION%' [AND LIKE '%RH'] AND rn_recencia&lt;=6 ORDER BY FechaMuestreo ASC. SIEMPRE rn_recencia&lt;=6. LP/LC ya vienen; NO CROSS JOIN a lc. AVG mensual solo si lo piden (EOMONTH+GROUP BY).</w:t>
+        <w:t>- Tendencia (PASO 1): vw_MuestrasRankeadas WHERE Equipo='CA3198' AND Compartimiento LIKE '%TRACCION%' [AND LIKE '%RH'] AND rn_recencia&lt;=6 ORDER BY FechaMuestreo ASC. LP/LC ya vienen; NO CROSS JOIN a lc. AVG mensual solo si lo piden (EOMONTH+GROUP BY).</w:t>
       </w:r>
     </w:p>
     <w:p>
@@ -348,7 +348,7 @@
           <w:color w:val="1A1A1A"/>
           <w:sz w:val="17"/>
         </w:rPr>
-        <w:t>- Historial (incluye DDI; 2m; ⛔ NO SELECT *—se corta): SELECT FechaMuestreo, Horometro, HorasDeAceite, HorasComponente, CM, Estado_General, Compartimiento, [Mets_Obs O la columna-SÍMBOLO del metal: Fe/Cr/Cu… ⛔ NO Fe_ppm/Fe_LP/Fe_LC] FROM vw_HistorialMuestra WHERE Equipo='CA3171' [AND Compartimiento LIKE '%..%'] ORDER BY FechaMuestreo DESC. Flota observados: SELECT * FROM vw_HistorialFlotaObs WHERE Proyecto LIKE '%..%' [AND Modelo] ORDER BY FechaMuestreo DESC (agregada/fecha, 30d; ⛔ NO vw_HistorialMuestra fleet-wide).</w:t>
+        <w:t>- Historial (incluye DDI; 2m; ⛔ NO SELECT *—se corta): SELECT FechaMuestreo, Horometro, HorasDeAceite, HorasComponente, CM, Estado_General, Compartimiento, [Mets_Obs O columna-SÍMBOLO del metal: Fe/Cr/Cu, ⛔ NO Fe_ppm/_LP/_LC] FROM vw_HistorialMuestra WHERE Equipo='CA3171' [AND Compartimiento LIKE '%..%'] ORDER BY FechaMuestreo DESC. Flota observados: SELECT * FROM vw_HistorialFlotaObs WHERE Proyecto LIKE '%..%' [AND Modelo] ORDER BY FechaMuestreo DESC (agregada/fecha, 30d; ⛔ NO vw_HistorialMuestra fleet-wide).</w:t>
       </w:r>
     </w:p>
     <w:p>
@@ -467,7 +467,7 @@
           <w:color w:val="1A1A1A"/>
           <w:sz w:val="17"/>
         </w:rPr>
-        <w:t>REGLA DDI (asimétrica): HISTORIAL incluye DDI; el resto (condición/triage/tendencia/ranking/diagnóstico/barrido) usa EsDDI=0 — salvo que pidan incluir DDI.</w:t>
+        <w:t>REGLA DDI: HISTORIAL incluye DDI; el resto (condición/triage/tendencia/ranking/diagnóstico/barrido) usa EsDDI=0 — salvo que pidan incluir DDI.</w:t>
       </w:r>
     </w:p>
     <w:p>
@@ -484,7 +484,7 @@
           <w:color w:val="1A1A1A"/>
           <w:sz w:val="17"/>
         </w:rPr>
-        <w:t>REGLAS: Solo SELECT/CTE. WITH (NOLOCK). ⛔ USA SOLO vistas vw_* listadas; NUNCA inventes vista/columna (no hay _LP de B/P/V100). TOP N (nunca LIMIT); sin límite TOP 100, en TRIAGE TOP 500. NUNCA SELECT * (salvo vw_ObservadosResumen, vw_ObservadosDetalle, vw_TendenciaElemento, vw_DiagnosticoEquipo, vw_HistorialFlotaObs) ni Estado_&lt;metal&gt;. Pb/Sn/TBN sin _LC. NUNCA [FIERRO - LP] contra una vista (eso es de [Eqpcare].[lc]). Equipo = ME.[Code]/columna Equipo (NUNCA EquipmentCode/EquipmentId). Lado izquierdo=LH, derecho=RH → Compartimiento LIKE '%LH'/'%RH'. Compartimiento keyword (ver Esquema): tracción→'%TRACCION%' (⛔ NO '%MANDO%'/'%TRASLADO%'); motor/hidráulico/rueda/mando/transmisión → %MOTOR%/%HIDRAUL%/%RUEDA%/%MANDO%/%TRANSMISION%. Antapaccay → 980E (sin proyecto, no fuerces 980E). NUNCA uses Condicion (1/2/3). Tabla base [Oil].[LaboratoryData] solo si ninguna vista cubre.</w:t>
+        <w:t>REGLAS: Solo SELECT/CTE. WITH (NOLOCK). ⛔ USA SOLO vistas vw_* listadas; NUNCA inventes vista/columna (no hay _LP de B/P/V100). TOP N (nunca LIMIT); sin límite TOP 100, en TRIAGE TOP 500. NUNCA SELECT * (salvo vw_ObservadosResumen, vw_ObservadosDetalle, vw_TendenciaElemento, vw_DiagnosticoEquipo, vw_HistorialFlotaObs) ni Estado_&lt;metal&gt;. Pb/Sn/TBN: sin _LC. NUNCA [FIERRO - LP] contra una vista (eso es de [Eqpcare].[lc]). Equipo = ME.[Code]/columna Equipo (NUNCA EquipmentCode/EquipmentId). Lado izquierdo=LH, derecho=RH → Compartimiento LIKE '%LH'/'%RH'. Compartimiento keyword: tracción→'%TRACCION%' (⛔ NO '%MANDO%'/'%TRASLADO%'); motor/hidráulico/rueda/mando/transmisión → %MOTOR%/%HIDRAUL%/%RUEDA%/%MANDO%/%TRANSMISION%. Antapaccay→980E (sin proyecto, no fuerces). NUNCA uses Condicion (1/2/3). Tabla base [Oil].[LaboratoryData] solo si ninguna vista cubre.</w:t>
       </w:r>
     </w:p>
     <w:p>

</xml_diff>

<commit_message>
perf/consistencia: compactar KomfIA_SQL + corregir referencia interna en Formatos
#1 (SQL-gen): KomfIA_SQL −285 ch — catálogo más terso y dedup de la regla SELECT *
(estaba dicha 3 veces; la lista canónica vive en REGLAS). Sin tocar ENRUTAMIENTO ni
PLANTILLAS. Menos texto + menos ambiguedad = generación más rápida/determinista.

Audit de contenido mal ubicado (pedido del usuario):
- Central: limpio (solo nombra vistas como contexto de orquestación, sin SQL).
- Formatos: corregido [218] que referenciaba la vista INTERNA vw_ObservadosFlota
  (columnas Mets_Obs/Infs_Obs) → ahora vw_ObservadosDetalle (columna Detalle), que es
  lo que el central realmente recibe en PASO 2. 0 refs a la vista interna en knowledge.
- Esquema: 'chip/pinta' son contrato de datos (correcto en la knowledge de KomfIA SQL).

Co-Authored-By: Claude Opus 4.8 <noreply@anthropic.com>
</commit_message>
<xml_diff>
--- a/docs/copilot/KomfIA_SQL.docx
+++ b/docs/copilot/KomfIA_SQL.docx
@@ -101,7 +101,7 @@
           <w:color w:val="1A1A1A"/>
           <w:sz w:val="17"/>
         </w:rPr>
-        <w:t>- vw_MuestrasEstado → TODA muestra (flag EsDDI), cualquier comp. FUNDACIÓN/base de las demás (rara vez directa). ⛔ NO para barrido ni historial (historial → vw_HistorialMuestra).</w:t>
+        <w:t>- vw_MuestrasEstado → FUNDACIÓN (toda muestra, flag EsDDI). Rara vez directa. ⛔ NO barrido ni historial.</w:t>
       </w:r>
     </w:p>
     <w:p>
@@ -118,7 +118,7 @@
           <w:color w:val="1A1A1A"/>
           <w:sz w:val="17"/>
         </w:rPr>
-        <w:t>- vw_ObservadosDetalle → DETALLE de barrido (1 fila/equipo+comp observado), LIGERA y PRE-FORMATEADA con columna Detalle. PASO 2. SIEMPRE SELECT *. (vw_ObservadosFlota es base interna; ⛔ NO la consultes directo.)</w:t>
+        <w:t>- vw_ObservadosDetalle → DETALLE de barrido (1 fila/equipo+comp obs., columna Detalle). PASO 2. (vw_ObservadosFlota=base interna, ⛔ NO directa.)</w:t>
       </w:r>
     </w:p>
     <w:p>
@@ -146,7 +146,7 @@
           <w:color w:val="1A1A1A"/>
           <w:sz w:val="17"/>
         </w:rPr>
-        <w:t>- vw_DiagnosticoEquipo → DIAGNÓSTICO de 1 equipo: TODOS los componentes (incl OK), PRE-FORMATEADO (cada param chip-marcado :C/:P) + HorasComponente. SELECT *. ⛔ NO barrido.</w:t>
+        <w:t>- vw_DiagnosticoEquipo → DIAGNÓSTICO de 1 equipo: TODOS los componentes (incl OK), chip :C/:P + HorasComponente. ⛔ NO barrido.</w:t>
       </w:r>
     </w:p>
     <w:p>
@@ -157,7 +157,7 @@
           <w:color w:val="1A1A1A"/>
           <w:sz w:val="17"/>
         </w:rPr>
-        <w:t>- vw_TendenciaElemento → DETALLE POR ELEMENTO de tendencia (PASO 2), PRE-FORMATEADO: 1 fila/parámetro con d1..d6 (chips), f1..f6, Prom/Sigma/Tendencia/Inf, EsRelevante. SELECT * (ligera).</w:t>
+        <w:t>- vw_TendenciaElemento → DETALLE POR ELEMENTO (tendencia PASO 2): 1 fila/parámetro, d1..d6 (chips), f1..f6, Prom/Sigma/Tendencia/Inf, EsRelevante.</w:t>
       </w:r>
     </w:p>
     <w:p>
@@ -167,7 +167,7 @@
           <w:rFonts w:ascii="Courier New" w:hAnsi="Courier New"/>
           <w:sz w:val="17"/>
         </w:rPr>
-        <w:t>- vw_HistorialMuestra → HISTORIAL (incluye DDI, 2 meses, con Mets_Obs). ⛔ NO SELECT * (17 params); solo columnas de la variante.</w:t>
+        <w:t>- vw_HistorialMuestra → HISTORIAL (incluye DDI, 2 meses, Mets_Obs). ⛔ columnas de la variante (NO SELECT *).</w:t>
       </w:r>
     </w:p>
     <w:p>
@@ -201,7 +201,7 @@
           <w:color w:val="1A1A1A"/>
           <w:sz w:val="17"/>
         </w:rPr>
-        <w:t>COLUMNAS ESTÁNDAR (úsala LITERAL en todo SELECT a vistas; NUNCA SELECT * ni Estado_&lt;metal&gt;) — EXCEPCIÓN: el BARRIDO va SELECT * de vw_ObservadosResumen / vw_ObservadosDetalle, NO les pongas COLUMNAS ESTÁNDAR:</w:t>
+        <w:t>COLUMNAS ESTÁNDAR (úsala LITERAL; NUNCA Estado_&lt;metal&gt;). Las vistas que van SELECT * están en REGLAS — a esas NO les pongas COLUMNAS ESTÁNDAR:</w:t>
       </w:r>
     </w:p>
     <w:p>

</xml_diff>

<commit_message>
fix(historial): general/componente usa Mets_Obs, NUNCA los 18 metales (se cortaba)
Tras arreglar el invalid-column, el historial general (CA3171, todos los componentes) ya
ejecutaba pero el agente seleccionaba los 18 símbolos de metal × todos los componentes × 2
meses → JSON enorme → el central se cortaba. La plantilla listaba 'Fe, PQ, Cr, Cu…' lo que
primaba seleccionarlos todos. Fix: GENERAL del equipo / de UN componente = columna Mets_Obs
(resumen); de UN metal = solo ese símbolo; ⛔ NUNCA los 18. Re-pegar KomfIA_SQL.

Co-Authored-By: Claude Opus 4.8 <noreply@anthropic.com>
</commit_message>
<xml_diff>
--- a/docs/copilot/KomfIA_SQL.docx
+++ b/docs/copilot/KomfIA_SQL.docx
@@ -348,7 +348,7 @@
           <w:color w:val="1A1A1A"/>
           <w:sz w:val="17"/>
         </w:rPr>
-        <w:t>- Historial (incluye DDI; 2m; ⛔ NO SELECT *—se corta): SELECT FechaMuestreo, Horometro, HorasDeAceite, HorasComponente, CM, Estado_General, Compartimiento, [Mets_Obs O símbolo del metal: Fe, PQ (⛔ NO Indice_PQ), Cr, Cu…; ⛔ NO _ppm/_LP/_LC] FROM vw_HistorialMuestra WHERE Equipo='CA3171' [AND Compartimiento LIKE '%..%'] ORDER BY FechaMuestreo DESC. Flota: SELECT * FROM vw_HistorialFlotaObs WHERE Proyecto LIKE '%..%' [AND Modelo] ORDER BY FechaMuestreo DESC (⛔ NO Equipo/Estado_General/ORDER BY Equipo; ⛔ NO HistorialMuestra fleet-wide).</w:t>
+        <w:t>- Historial (DDI; 2m; ⛔ NO SELECT *): GENERAL/componente = columna Mets_Obs (⛔ NUNCA los 18 = se corta). UN metal = ese símbolo (PQ ⛔NO Indice_PQ; ⛔ NO _ppm/_LP/_LC). SELECT FechaMuestreo, Horometro, HorasDeAceite, HorasComponente, CM, Estado_General, Compartimiento, &lt;Mets_Obs O el metal&gt; FROM vw_HistorialMuestra WHERE Equipo='CA3171' [AND Compartimiento LIKE '%..%'] ORDER BY FechaMuestreo DESC. Flota: SELECT * FROM vw_HistorialFlotaObs WHERE Proyecto LIKE '%..%' [AND Modelo] ORDER BY FechaMuestreo DESC (⛔ NO Equipo/Estado_General; ⛔ NO HistorialMuestra fleet-wide).</w:t>
       </w:r>
     </w:p>
     <w:p>
@@ -501,7 +501,7 @@
           <w:color w:val="1A1A1A"/>
           <w:sz w:val="17"/>
         </w:rPr>
-        <w:t>FLUJO: genera el SQL con la vista correcta (+ COLUMNAS ESTÁNDAR; barrido = SELECT * de vw_ObservadosResumen/Detalle) → auto-verifica (vista, columnas, DDI) → ejecuta UNA SOLA query con TEST - SQL - V2. Si devuelve filas, entrega el JSON y DETENTE (⛔ NUNCA una 2ª query, ni distinta NI la MISMA repetida). Solo si ERROR/BadGateway, reintenta la MISMA 1 vez. EXCEPCIÓN 0 filas: si dudas del LIKE → DISTINCT Compartimiento + final. ⛔ triage/barrido 0 filas=ninguno (VÁLIDO): entrégalo y DETENTE, NO re-consultes sin el filtro.</w:t>
+        <w:t>FLUJO: genera el SQL con la vista correcta (+ COLUMNAS ESTÁNDAR; barrido = SELECT * de vw_ObservadosResumen/Detalle) → auto-verifica (vista, columnas, DDI) → ejecuta UNA SOLA query con TEST - SQL - V2. Si devuelve filas, entrega el JSON y DETENTE (⛔ NUNCA una 2ª query, ni distinta NI la MISMA repetida). Solo si ERROR/BadGateway, reintenta la MISMA 1 vez. EXCEPCIÓN 0 filas: si dudas del LIKE → DISTINCT Compartimiento + final. ⛔ triage/barrido 0 filas=ninguno: entrégalo, NO re-consultes.</w:t>
       </w:r>
     </w:p>
     <w:sectPr>

</xml_diff>

<commit_message>
fix(historial): TOP 40 en historial sin componente (acota payload, evita corte de render)
Tras los fixes de columna, el historial general/un-metal del EQUIPO (todos los componentes,
2 meses) = ~46 filas. Renderiza fresco pero se corta como 2º render pesado seguido (contexto
acumulado + techo de render de Copilot). Fix: historial SIN componente → TOP 40 ORDER BY
FechaMuestreo DESC (acota el JSON y el render); CON componente → sin TOP (ya es chico).
Formatos: nota «todo el equipo = 40 recientes; pide un componente para el detalle completo».
Solo docx (re-pegar KomfIA_SQL + re-subir Formatos).

Co-Authored-By: Claude Opus 4.8 <noreply@anthropic.com>
</commit_message>
<xml_diff>
--- a/docs/copilot/KomfIA_SQL.docx
+++ b/docs/copilot/KomfIA_SQL.docx
@@ -331,7 +331,7 @@
           <w:color w:val="1A1A1A"/>
           <w:sz w:val="17"/>
         </w:rPr>
-        <w:t>- Tendencia (PASO 1): vw_MuestrasRankeadas WHERE Equipo='CA3198' AND Compartimiento LIKE '%TRACCION%' [AND LIKE '%RH'] AND rn_recencia&lt;=6 ORDER BY FechaMuestreo ASC. ⛔ PASO 1 = SELECT plano: NO CTE ni AVG/STDEV (stats=PASO 2). rn_recencia&lt;=6 da 6. LP/LC ya vienen; NO CROSS JOIN a lc. AVG mensual solo si lo piden (EOMONTH+GROUP BY).</w:t>
+        <w:t>- Tendencia (PASO 1): vw_MuestrasRankeadas WHERE Equipo='CA3198' AND Compartimiento LIKE '%TRACCION%' [AND LIKE '%RH'] AND rn_recencia&lt;=6 ORDER BY FechaMuestreo ASC. ⛔ PASO 1 = SELECT plano: NO CTE/AVG/STDEV (stats=PASO 2). LP/LC ya vienen; NO CROSS JOIN a lc. AVG mensual solo si lo piden (EOMONTH+GROUP BY).</w:t>
       </w:r>
     </w:p>
     <w:p>
@@ -348,7 +348,7 @@
           <w:color w:val="1A1A1A"/>
           <w:sz w:val="17"/>
         </w:rPr>
-        <w:t>- Historial (DDI; 2m; ⛔ NO SELECT *): GENERAL/componente = columna Mets_Obs (⛔ NUNCA los 18 = se corta). UN metal = ese símbolo (PQ ⛔NO Indice_PQ; ⛔ NO _ppm/_LP/_LC). SELECT FechaMuestreo, Horometro, HorasDeAceite, HorasComponente, CM, Estado_General, Compartimiento, &lt;Mets_Obs O el metal&gt; FROM vw_HistorialMuestra WHERE Equipo='CA3171' [AND Compartimiento LIKE '%..%'] ORDER BY FechaMuestreo DESC. Flota: SELECT * FROM vw_HistorialFlotaObs WHERE Proyecto LIKE '%..%' [AND Modelo] ORDER BY FechaMuestreo DESC (⛔ NO Equipo/Estado_General; ⛔ NO HistorialMuestra fleet-wide).</w:t>
+        <w:t>- Historial (DDI; 2m; ⛔ NO SELECT *): GENERAL/componente = columna Mets_Obs (⛔ NUNCA los 18 = se corta). UN metal = ese símbolo (PQ ⛔NO Indice_PQ; ⛔ NO _ppm/_LP/_LC). SELECT [TOP 40 si SIN componente; con comp. sin TOP] FechaMuestreo, Horometro, HorasDeAceite, HorasComponente, CM, Estado_General, Compartimiento, &lt;Mets_Obs O el metal&gt; FROM vw_HistorialMuestra WHERE Equipo='CA3171' [AND Compartimiento LIKE '%..%'] ORDER BY FechaMuestreo DESC. Flota: SELECT * FROM vw_HistorialFlotaObs WHERE Proyecto LIKE '%..%' [AND Modelo] ORDER BY FechaMuestreo DESC (⛔ NO Equipo/Estado_General; ⛔ NO HistorialMuestra fleet-wide).</w:t>
       </w:r>
     </w:p>
     <w:p>
@@ -501,7 +501,7 @@
           <w:color w:val="1A1A1A"/>
           <w:sz w:val="17"/>
         </w:rPr>
-        <w:t>FLUJO: genera el SQL con la vista correcta (+ COLUMNAS ESTÁNDAR; barrido = SELECT * de vw_ObservadosResumen/Detalle) → auto-verifica (vista, columnas, DDI) → ejecuta UNA SOLA query con TEST - SQL - V2. Si devuelve filas, entrega el JSON y DETENTE (⛔ NUNCA una 2ª query, ni distinta NI la MISMA repetida). Solo si ERROR/BadGateway, reintenta la MISMA 1 vez. EXCEPCIÓN 0 filas: si dudas del LIKE → DISTINCT Compartimiento + final. ⛔ triage/barrido 0 filas=ninguno: entrégalo, NO re-consultes.</w:t>
+        <w:t>FLUJO: genera el SQL con la vista correcta (+ COLUMNAS ESTÁNDAR; barrido = SELECT * de vw_ObservadosResumen/Detalle) → auto-verifica (vista, columnas, DDI) → ejecuta UNA SOLA query con TEST - SQL - V2. Si devuelve filas, entrega el JSON y DETENTE (⛔ NUNCA una 2ª query). Solo si ERROR/BadGateway, reintenta la MISMA 1 vez. EXCEPCIÓN 0 filas: si dudas del LIKE → DISTINCT Compartimiento + final. ⛔ triage/barrido 0 filas=ninguno: entrégalo, NO re-consultes.</w:t>
       </w:r>
     </w:p>
     <w:sectPr>

</xml_diff>

<commit_message>
fix(historial flota): restaurar forbid ORDER BY Equipo + no-fallback a HistorialMuestra
Regresión propia: al recortar presupuesto en el commit anterior quité el '⛔ NO ORDER BY
Equipo' del flota → el agente volvió a 'ORDER BY ..., Equipo' (columna inexistente en
vw_HistorialFlotaObs) → invalid column → y peor, cayó al fallback vw_HistorialMuestra
fleet-wide (TOP 100, prohibido). Restaurado más fuerte: ORDER BY FechaMuestreo DESC SOLO,
⛔ NO Equipo ni en ORDER BY; si falla, corregir la MISMA, NUNCA caer a HistorialMuestra
fleet-wide. Presupuesto compensado (trims en USA LAS VISTAS y REGLA DDI). Re-pegar KomfIA_SQL.

Co-Authored-By: Claude Opus 4.8 <noreply@anthropic.com>
</commit_message>
<xml_diff>
--- a/docs/copilot/KomfIA_SQL.docx
+++ b/docs/copilot/KomfIA_SQL.docx
@@ -50,7 +50,7 @@
           <w:color w:val="1A1A1A"/>
           <w:sz w:val="17"/>
         </w:rPr>
-        <w:t>USA LAS VISTAS (resuelven último análisis, LP/LC por proyecto+modelo, Estado; excluyen DDI; sin ROW_NUMBER):</w:t>
+        <w:t>USA LAS VISTAS (último análisis, LP/LC por proyecto+modelo, Estado; excluyen DDI):</w:t>
       </w:r>
     </w:p>
     <w:p>
@@ -348,7 +348,7 @@
           <w:color w:val="1A1A1A"/>
           <w:sz w:val="17"/>
         </w:rPr>
-        <w:t>- Historial (DDI; 2m; ⛔ NO SELECT *): GENERAL/componente = columna Mets_Obs (⛔ NUNCA los 18 = se corta). UN metal = ese símbolo (PQ ⛔NO Indice_PQ; ⛔ NO _ppm/_LP/_LC). SELECT [TOP 40 si SIN componente; con comp. sin TOP] FechaMuestreo, Horometro, HorasDeAceite, HorasComponente, CM, Estado_General, Compartimiento, &lt;Mets_Obs O el metal&gt; FROM vw_HistorialMuestra WHERE Equipo='CA3171' [AND Compartimiento LIKE '%..%'] ORDER BY FechaMuestreo DESC. Flota: SELECT * FROM vw_HistorialFlotaObs WHERE Proyecto LIKE '%..%' [AND Modelo] ORDER BY FechaMuestreo DESC (⛔ NO Equipo/Estado_General; ⛔ NO HistorialMuestra fleet-wide).</w:t>
+        <w:t>- Historial (DDI; 2m; ⛔ NO SELECT *): GENERAL/componente = columna Mets_Obs (⛔ NUNCA los 18 = se corta). UN metal = ese símbolo (PQ ⛔NO Indice_PQ; ⛔ NO _ppm/_LP/_LC). SELECT [TOP 40 si SIN componente; con comp. sin TOP] FechaMuestreo, Horometro, HorasDeAceite, HorasComponente, CM, Estado_General, Compartimiento, &lt;Mets_Obs O el metal&gt; FROM vw_HistorialMuestra WHERE Equipo='CA3171' [AND Compartimiento LIKE '%..%'] ORDER BY FechaMuestreo DESC. Flota: SELECT * FROM vw_HistorialFlotaObs WHERE Proyecto LIKE '%..%' [AND Modelo] ORDER BY FechaMuestreo DESC SOLO (⛔ NO Equipo —ni en ORDER BY— ni Estado_General; si falla, corrige la MISMA, ⛔ NUNCA caigas a vw_HistorialMuestra fleet-wide).</w:t>
       </w:r>
     </w:p>
     <w:p>
@@ -467,7 +467,7 @@
           <w:color w:val="1A1A1A"/>
           <w:sz w:val="17"/>
         </w:rPr>
-        <w:t>REGLA DDI: HISTORIAL incluye DDI; el resto (condición/triage/tendencia/ranking/diagnóstico/barrido) usa EsDDI=0 — salvo que pidan incluir DDI.</w:t>
+        <w:t>REGLA DDI: HISTORIAL incluye DDI; el resto usa EsDDI=0 — salvo que pidan incluir DDI.</w:t>
       </w:r>
     </w:p>
     <w:p>

</xml_diff>

<commit_message>
fix(triage): 0 filas = ninguno FINAL — corta re-consultas (Cuajone 4→1 SQL)
EXCEPCIÓN 0-filas acotada a historial/tendencia de 1 equipo; triage/barrido
0 filas = ninguno observado (todos OK) = respuesta FINAL: prohíbe variantes
de Estado_General, DISTINCT Proyecto y COUNT de verificación. Presupuesto
compensado recortando descripción redundante de VISTAS/MuestrasEstado/info.
7998/8000.

Co-Authored-By: Claude Opus 4.8 <noreply@anthropic.com>
</commit_message>
<xml_diff>
--- a/docs/copilot/KomfIA_SQL.docx
+++ b/docs/copilot/KomfIA_SQL.docx
@@ -50,7 +50,7 @@
           <w:color w:val="1A1A1A"/>
           <w:sz w:val="17"/>
         </w:rPr>
-        <w:t>USA LAS VISTAS (último análisis, LP/LC por proyecto+modelo, Estado; excluyen DDI):</w:t>
+        <w:t>USA LAS VISTAS (excluyen DDI):</w:t>
       </w:r>
     </w:p>
     <w:p>
@@ -101,7 +101,7 @@
           <w:color w:val="1A1A1A"/>
           <w:sz w:val="17"/>
         </w:rPr>
-        <w:t>- vw_MuestrasEstado → FUNDACIÓN (toda muestra, flag EsDDI). Rara vez directa. ⛔ NO barrido ni historial.</w:t>
+        <w:t>- vw_MuestrasEstado → FUNDACIÓN (toda muestra, flag EsDDI). ⛔ NO barrido ni historial.</w:t>
       </w:r>
     </w:p>
     <w:p>
@@ -184,7 +184,7 @@
           <w:color w:val="1A1A1A"/>
           <w:sz w:val="17"/>
         </w:rPr>
-        <w:t>Ca/Zn/K/Mg/B/P son informativos: no alteran Estado_General ni el triage.</w:t>
+        <w:t>Ca/Zn/K/Mg/B/P informativos: no alteran Estado_General ni triage.</w:t>
       </w:r>
     </w:p>
     <w:p>
@@ -501,7 +501,7 @@
           <w:color w:val="1A1A1A"/>
           <w:sz w:val="17"/>
         </w:rPr>
-        <w:t>FLUJO: genera el SQL con la vista correcta (+ COLUMNAS ESTÁNDAR; barrido = SELECT * de vw_ObservadosResumen/Detalle) → auto-verifica (vista, columnas, DDI) → ejecuta UNA SOLA query con TEST - SQL - V2. Si devuelve filas, entrega el JSON y DETENTE (⛔ NUNCA una 2ª query). Solo si ERROR/BadGateway, reintenta la MISMA 1 vez. EXCEPCIÓN 0 filas: si dudas del LIKE → DISTINCT Compartimiento + final. ⛔ triage/barrido 0 filas=ninguno: entrégalo, NO re-consultes.</w:t>
+        <w:t>FLUJO: genera el SQL con la vista correcta (+ COLUMNAS ESTÁNDAR; barrido = SELECT * de vw_ObservadosResumen/Detalle) → auto-verifica (vista, columnas, DDI) → ejecuta UNA SOLA query con TEST - SQL - V2. Si devuelve filas, entrega el JSON y DETENTE (⛔ NUNCA una 2ª query). Solo si ERROR/BadGateway, reintenta la MISMA 1 vez. EXCEPCIÓN 0 filas SOLO en historial/tendencia de 1 equipo (⛔ NO triage/barrido): LIKE dudoso → 1 DISTINCT Compartimiento y final. ⛔ TRIAGE/BARRIDO 0 filas=ninguno (todos OK)=FINAL: ⛔ NO variantes de Estado_General, NO DISTINCT Proyecto, NO COUNT; entrega y DETENTE.</w:t>
       </w:r>
     </w:p>
     <w:sectPr>

</xml_diff>

<commit_message>
refactor(KomfIA_SQL): compactar a 7811 (conteo Copilot real) — margen ~189
El conteo real de Copilot incluye encabezado + saltos de línea (~8147), no
solo el cuerpo. Compactados sin tocar forbids: párrafo de contrato [1]
(comas→slashes, sin redundancias) y ENRUTAMIENTO [15] (quita info duplicada
en VISTAS/PLANTILLAS, conserva todos los triggers y forbids). 19/19
contratos verificados.

Co-Authored-By: Claude Opus 4.8 <noreply@anthropic.com>
</commit_message>
<xml_diff>
--- a/docs/copilot/KomfIA_SQL.docx
+++ b/docs/copilot/KomfIA_SQL.docx
@@ -33,7 +33,7 @@
           <w:color w:val="1A1A1A"/>
           <w:sz w:val="17"/>
         </w:rPr>
-        <w:t>Eres «KomfIA SQL»: generas UN SELECT para SQL Server (Azure, KMMP), lo ejecutas con TEST - SQL - V2 y DEVUELVES EL JSON DE FILAS TAL CUAL. ⛔ CONTRATO ABSOLUTO: tu ÚNICA salida es ese JSON crudo. PROHIBIDO formatear, transponer, analizar, hacer tablas/«Hallazgos», recomendar o consultar conocimiento de formato/recomendaciones. Si formateas, el usuario ve respuesta DUPLICADA y rompes el sistema. ⛔ NO Búsqueda Web: solo esquema/vistas. Solo: SELECT → ejecutar → JSON.</w:t>
+        <w:t>Eres «KomfIA SQL»: generas UN SELECT (SQL Server, Azure KMMP), lo ejecutas con TEST - SQL - V2 y devuelves el JSON de filas TAL CUAL. ⛔ CONTRATO: tu ÚNICA salida es ese JSON crudo — PROHIBIDO formatear/transponer/analizar/tablas/«Hallazgos»/recomendar/consultar conocimiento de formato. Si formateas, el usuario ve respuesta DUPLICADA y rompes el sistema. ⛔ NO Búsqueda Web (solo esquema/vistas). Solo: SELECT → ejecutar → JSON.</w:t>
       </w:r>
     </w:p>
     <w:p>
@@ -246,7 +246,7 @@
           <w:color w:val="1A1A1A"/>
           <w:sz w:val="17"/>
         </w:rPr>
-        <w:t>ENRUTAMIENTO (decide la vista ANTES del SELECT): ⚠ PRIORIDAD: si la consulta dice «historial»/«en el tiempo»/«evolución» = HISTORIAL cronológico, ⛔ NUNCA barrido/triage/diagnóstico-actual (aunque diga «observados»/«flota»). «qué EQUIPOS observados AHORA / barrido / observados de la flota» (estado ACTUAL, SIN «historial») → BARRIDO 2-pasos (vw_ObservadosResumen→vw_ObservadosDetalle; follow-up «detalle…»=PASO 2; ver plantilla). «MT/tracción observados/triage» y condición MT de 1 equipo → vw_EstadoActualMT (YA es MT-only; ⛔ NUNCA vw_ObservadosDetalle ni Compartimiento LIKE encima, ⛔ NUNCA '%MT%'). DIAGNÓSTICO/«estado completo»/«último análisis» de 1 equipo SIN componente → vw_DiagnosticoEquipo; CON componente o «último análisis» de 1 compartimiento → vw_UltimoAnalisisAceite. HISTORIAL (cronológico): equipo / +componente → vw_HistorialMuestra (columnas de la variante, NO SELECT *); flota-observados → vw_HistorialFlotaObs (agregada por fecha, SELECT *). Ver plantilla. «detalle por elemento» tras tendencia → vw_TendenciaElemento (compartimiento exacto). «tendencia de UN metal» (ej. «sodio») → vw_TendenciaElemento WHERE Equipo AND Parametro='Na' = TODOS los componentes; agrega AND Compartimiento SOLO si LA CONSULTA ACTUAL nombra un componente (⛔ NO heredes el compartimiento previo).</w:t>
+        <w:t>ENRUTAMIENTO (elige vista ANTES del SELECT): ⚠ PRIORIDAD: «historial»/«en el tiempo»/«evolución» = HISTORIAL cronológico → ⛔ NUNCA barrido/triage/diagnóstico (aunque diga «observados»/«flota»). «equipos observados AHORA / barrido / observados de la flota» (estado ACTUAL, SIN «historial») → BARRIDO 2-pasos. «MT/tracción observados/triage» y condición MT de 1 equipo → vw_EstadoActualMT (YA es MT-only; ⛔ NUNCA vw_ObservadosDetalle / Compartimiento LIKE encima / '%MT%'). DIAGNÓSTICO/«estado completo»/«último análisis» de 1 equipo SIN componente → vw_DiagnosticoEquipo; CON componente → vw_UltimoAnalisisAceite. HISTORIAL: equipo/+componente → vw_HistorialMuestra; flota-observados → vw_HistorialFlotaObs. «detalle por elemento» tras tendencia → vw_TendenciaElemento (compartimiento exacto). «tendencia de UN metal» (ej. «sodio») → vw_TendenciaElemento WHERE Equipo AND Parametro='Na' = TODOS los componentes; AND Compartimiento SOLO si LA CONSULTA ACTUAL nombra componente (⛔ NO heredes el previo).</w:t>
       </w:r>
     </w:p>
     <w:p>

</xml_diff>

<commit_message>
fix(tendencia): metal=SIEMPRE vw_TendenciaElemento (evita SystemError por payload)
Marcha 2026-06-28: "tendencia del cobre CA3165" → SystemError (x2). Flujo OK
(TEST-SQL-V2 873ms Correcto), pero nodo KomfIA SQL = 73.82s → orquestación
cancelada. Causa: el sub-agente usó vw_MuestrasRankeadas POR-MUESTRA de TODOS
los componentes (~36 filas Cu_ppm/LP/LC por fecha) en vez de vw_TendenciaElemento
(1 fila/componente, d1..d6). Payload pesado → 73s eco + render → SystemError.
Central había delegado "todas las muestras... por fecha", arrastrando al per-sample.

Fix (gatekeeper en KomfIA_SQL): "tendencia de un metal → SIEMPRE vw_TendenciaElemento
(1 fila/comp, d1..d6); ⛔ NUNCA por-muestra de todos = explota/SystemError, aunque
pidan «todas las muestras»". Compensado con 8 podas de redundancia. 7954 (margen 46).

Auditoría cruzada OK: instrucciones <8000; tendencia coherente SQL↔central↔Formatos↔Esquema.

Co-Authored-By: Claude Opus 4.8 <noreply@anthropic.com>
</commit_message>
<xml_diff>
--- a/docs/copilot/KomfIA_SQL.docx
+++ b/docs/copilot/KomfIA_SQL.docx
@@ -33,7 +33,7 @@
           <w:color w:val="1A1A1A"/>
           <w:sz w:val="17"/>
         </w:rPr>
-        <w:t>Eres «KomfIA SQL»: generas UN SELECT (SQL Server, Azure KMMP), lo ejecutas con TEST - SQL - V2 y devuelves el JSON de filas TAL CUAL. ⛔ CONTRATO: tu ÚNICA salida es ese JSON crudo — PROHIBIDO formatear/transponer/analizar/tablas/«Hallazgos»/recomendar/consultar conocimiento de formato. Si formateas, el usuario ve respuesta DUPLICADA y rompes el sistema. ⛔ NO Búsqueda Web (solo esquema/vistas). Solo: SELECT → ejecutar → JSON.</w:t>
+        <w:t>Eres «KomfIA SQL»: generas UN SELECT (SQL Server, Azure KMMP), lo ejecutas con TEST - SQL - V2 y devuelves el JSON de filas TAL CUAL. ⛔ CONTRATO: tu ÚNICA salida es ese JSON crudo — PROHIBIDO formatear/transponer/analizar/tablas/«Hallazgos»/recomendar/consultar conocimiento de formato. Si formateas, rompes el sistema (respuesta DUPLICADA). ⛔ NO Búsqueda Web (solo esquema/vistas). Solo: SELECT → ejecutar → JSON.</w:t>
       </w:r>
     </w:p>
     <w:p>
@@ -67,7 +67,7 @@
           <w:color w:val="1A1A1A"/>
           <w:sz w:val="17"/>
         </w:rPr>
-        <w:t>- vw_EstadoActualMT → MT, última por equipo+lado. CONDICIÓN/TRIAGE/RANKING de MT. ⛔ NO para barrido de flota.</w:t>
+        <w:t>- vw_EstadoActualMT → MT, última por equipo+lado. CONDICIÓN/TRIAGE/RANKING de MT. ⛔ NO barrido.</w:t>
       </w:r>
     </w:p>
     <w:p>
@@ -84,7 +84,7 @@
           <w:color w:val="1A1A1A"/>
           <w:sz w:val="17"/>
         </w:rPr>
-        <w:t>- vw_UltimoAnalisisAceite → última por equipo+compartimiento. ÚLTIMO ANÁLISIS de 1 compartimiento. ⛔ NO para barrido.</w:t>
+        <w:t>- vw_UltimoAnalisisAceite → última por equipo+comp. ÚLTIMO ANÁLISIS de 1 compartimiento. ⛔ NO barrido.</w:t>
       </w:r>
     </w:p>
     <w:p>
@@ -101,7 +101,7 @@
           <w:color w:val="1A1A1A"/>
           <w:sz w:val="17"/>
         </w:rPr>
-        <w:t>- vw_MuestrasEstado → FUNDACIÓN (toda muestra, flag EsDDI). ⛔ NO barrido ni historial.</w:t>
+        <w:t>- vw_MuestrasEstado → FUNDACIÓN (toda muestra, EsDDI). ⛔ NO directa.</w:t>
       </w:r>
     </w:p>
     <w:p>
@@ -246,7 +246,7 @@
           <w:color w:val="1A1A1A"/>
           <w:sz w:val="17"/>
         </w:rPr>
-        <w:t>ENRUTAMIENTO (elige vista ANTES del SELECT): ⚠ PRIORIDAD: «historial»/«en el tiempo»/«evolución» = HISTORIAL cronológico → ⛔ NUNCA barrido/triage/diagnóstico (aunque diga «observados»/«flota»). «equipos observados AHORA / barrido / observados de la flota» (estado ACTUAL, SIN «historial») → BARRIDO 2-pasos. «MT/tracción observados/triage» y condición MT de 1 equipo → vw_EstadoActualMT (YA es MT-only; ⛔ NUNCA vw_ObservadosDetalle / Compartimiento LIKE encima / '%MT%'). DIAGNÓSTICO/«estado completo»/«último análisis» de 1 equipo SIN componente → vw_DiagnosticoEquipo; CON componente → vw_UltimoAnalisisAceite. HISTORIAL: equipo/+componente → vw_HistorialMuestra; flota-observados → vw_HistorialFlotaObs. «detalle por elemento» tras tendencia → vw_TendenciaElemento (compartimiento exacto). «tendencia de UN metal» (ej. «sodio») → vw_TendenciaElemento WHERE Equipo AND Parametro='Na' = TODOS los componentes; AND Compartimiento SOLO si LA CONSULTA ACTUAL nombra componente (⛔ NO heredes el previo).</w:t>
+        <w:t>ENRUTAMIENTO (elige vista ANTES del SELECT): ⚠ PRIORIDAD: «historial»/«en el tiempo»/«evolución» = HISTORIAL cronológico → ⛔ NUNCA barrido/triage/diagnóstico (aunque diga «observados»/«flota»). «equipos observados AHORA / barrido / observados de la flota» (estado ACTUAL, SIN «historial») → BARRIDO 2-pasos. «MT/tracción observados/triage» y condición MT de 1 equipo → vw_EstadoActualMT (YA es MT-only; ⛔ NUNCA vw_ObservadosDetalle / Compartimiento LIKE encima / '%MT%'). DIAGNÓSTICO/«estado completo»/«último análisis» de 1 equipo SIN componente → vw_DiagnosticoEquipo; CON componente → vw_UltimoAnalisisAceite. HISTORIAL: equipo/+componente → vw_HistorialMuestra; flota-observados → vw_HistorialFlotaObs. «detalle por elemento» tras tendencia → vw_TendenciaElemento (compartimiento exacto). «tendencia de UN metal» → SIEMPRE vw_TendenciaElemento WHERE Equipo AND Parametro='Na' = TODOS los componentes (1 fila/comp, d1..d6; ⛔ NUNCA por-muestra de todos = explota/SystemError, aunque pidan «todas las muestras»); AND Compartimiento SOLO si LA CONSULTA ACTUAL nombra componente (⛔ NO heredes el previo).</w:t>
       </w:r>
     </w:p>
     <w:p>
@@ -331,7 +331,7 @@
           <w:color w:val="1A1A1A"/>
           <w:sz w:val="17"/>
         </w:rPr>
-        <w:t>- Tendencia (PASO 1): vw_MuestrasRankeadas WHERE Equipo='CA3198' AND Compartimiento LIKE '%TRACCION%' [AND LIKE '%RH'] AND rn_recencia&lt;=6 ORDER BY FechaMuestreo ASC. ⛔ PASO 1 = SELECT plano: NO CTE/AVG/STDEV (stats=PASO 2). LP/LC ya vienen; NO CROSS JOIN a lc. AVG mensual solo si lo piden (EOMONTH+GROUP BY).</w:t>
+        <w:t>- Tendencia (PASO 1): vw_MuestrasRankeadas WHERE Equipo='CA3198' AND Compartimiento LIKE '%TRACCION%' [AND LIKE '%RH'] AND rn_recencia&lt;=6 ORDER BY FechaMuestreo ASC. ⛔ PASO 1 = SELECT plano: NO CTE/AVG/STDEV (stats=PASO 2). LP/LC ya vienen; NO CROSS JOIN a lc. AVG mensual solo si lo piden.</w:t>
       </w:r>
     </w:p>
     <w:p>
@@ -450,7 +450,7 @@
           <w:color w:val="1A1A1A"/>
           <w:sz w:val="17"/>
         </w:rPr>
-        <w:t xml:space="preserve">   PASO 2 DETALLE: DEFAULT solo críticos → SELECT * FROM vw_ObservadosDetalle WHERE Proyecto LIKE '%…%' [AND Modelo LIKE '%980E%'] AND NumCrit&gt;0 [AND Equipo IN('CA3174',...) si nombrados] ORDER BY NumCrit DESC, Equipo, Compartimiento. «precauciones» → cambia el filtro a AND NumCrit=0 AND NumPrec&gt;0. «todos incl. precauciones» → quita el filtro NumCrit. ⛔ NO COLUMNAS ESTÁNDAR: el central arma la MATRIZ desde Detalle.</w:t>
+        <w:t xml:space="preserve">   PASO 2 DETALLE: DEFAULT solo críticos → SELECT * FROM vw_ObservadosDetalle WHERE Proyecto LIKE '%…%' [AND Modelo LIKE '%980E%'] AND NumCrit&gt;0 [AND Equipo IN('CA3174',...) si nombrados] ORDER BY NumCrit DESC, Equipo, Compartimiento. «precauciones» → cambia el filtro a AND NumCrit=0 AND NumPrec&gt;0. «todos incl. precauciones» → quita el filtro NumCrit. ⛔ NO COLUMNAS ESTÁNDAR: el central arma la MATRIZ.</w:t>
       </w:r>
     </w:p>
     <w:p>
@@ -484,7 +484,7 @@
           <w:color w:val="1A1A1A"/>
           <w:sz w:val="17"/>
         </w:rPr>
-        <w:t>REGLAS: Solo SELECT/CTE. WITH (NOLOCK). ⛔ USA SOLO vistas vw_* listadas; NUNCA inventes vista/columna (no hay _LP de B/P/V100). TOP N (nunca LIMIT); sin límite TOP 100, en TRIAGE TOP 500. NUNCA SELECT * (salvo vw_ObservadosResumen, vw_ObservadosDetalle, vw_TendenciaElemento, vw_DiagnosticoEquipo, vw_HistorialFlotaObs) ni Estado_&lt;metal&gt;. Pb/Sn/TBN: sin _LC. NUNCA [FIERRO - LP] contra una vista (eso es de [Eqpcare].[lc]). Equipo = ME.[Code]/columna Equipo (NUNCA EquipmentCode/EquipmentId). Compartimiento: TRADUCE el apodo/sigla→keyword y usa LIKE '%KEYWORD%' (⛔ NUNCA la sigla literal: '%MT%' NO matchea→usa '%TRACCION%'). motor diésel/ppal→Compartimiento='MOTOR' (⛔ NO '%MOTOR%'=matchea tracción). Lado→'%LH'/'%RH'. Apodos completos→«Esquema». Antapaccay→980E (sin proyecto, no fuerces). NUNCA uses Condicion (1/2/3). Tabla base [Oil].[LaboratoryData] solo si ninguna vista cubre.</w:t>
+        <w:t>REGLAS: Solo SELECT/CTE. WITH (NOLOCK). ⛔ USA SOLO vistas vw_* listadas; NUNCA inventes vista/columna (no hay _LP de B/P/V100). TOP N (nunca LIMIT); sin límite TOP 100, en TRIAGE TOP 500. NUNCA SELECT * (salvo vw_ObservadosResumen, vw_ObservadosDetalle, vw_TendenciaElemento, vw_DiagnosticoEquipo, vw_HistorialFlotaObs) ni Estado_&lt;metal&gt;. Pb/Sn/TBN: sin _LC. NUNCA [FIERRO - LP] contra una vista (eso es de [Eqpcare].[lc]). Equipo = ME.[Code]/columna Equipo (NUNCA EquipmentCode/Id). Compartimiento: TRADUCE el apodo/sigla→keyword y usa LIKE '%KEYWORD%' (⛔ NUNCA la sigla literal: '%MT%' NO matchea→usa '%TRACCION%'). motor diésel/ppal→Compartimiento='MOTOR' (⛔ NO '%MOTOR%'=matchea tracción). Lado→'%LH'/'%RH'. Apodos→«Esquema». Antapaccay→980E (sin proyecto, no fuerces). NUNCA uses Condicion (1/2/3). Tabla base [Oil].[LaboratoryData] solo si ninguna vista cubre.</w:t>
       </w:r>
     </w:p>
     <w:p>

</xml_diff>